<commit_message>
Minor changes to W1.
</commit_message>
<xml_diff>
--- a/Syllabus/DL_syllabus.docx
+++ b/Syllabus/DL_syllabus.docx
@@ -4569,6 +4569,8 @@
       <w:r>
         <w:rPr>
           <w:rStyle w:val="CommentReference"/>
+          <w:sz w:val="22"/>
+          <w:szCs w:val="22"/>
           <w:lang w:val="en-GB"/>
         </w:rPr>
         <w:commentReference w:id="0"/>
@@ -4731,6 +4733,8 @@
       <w:r>
         <w:rPr>
           <w:rStyle w:val="CommentReference"/>
+          <w:sz w:val="22"/>
+          <w:szCs w:val="22"/>
           <w:lang w:val="en-GB"/>
         </w:rPr>
         <w:commentReference w:id="1"/>
@@ -4861,6 +4865,8 @@
       <w:r>
         <w:rPr>
           <w:rStyle w:val="CommentReference"/>
+          <w:sz w:val="22"/>
+          <w:szCs w:val="22"/>
           <w:lang w:val="en-GB"/>
         </w:rPr>
         <w:commentReference w:id="2"/>
@@ -5218,16 +5224,7 @@
           <w:u w:val="single"/>
           <w:lang w:val="en-GB"/>
         </w:rPr>
-        <w:t>2</w:t>
-      </w:r>
-      <w:r>
-        <w:rPr>
-          <w:b/>
-          <w:color w:val="44546A" w:themeColor="text2"/>
-          <w:u w:val="single"/>
-          <w:lang w:val="en-GB"/>
-        </w:rPr>
-        <w:t>0</w:t>
+        <w:t>15</w:t>
       </w:r>
       <w:r>
         <w:rPr>
@@ -5441,7 +5438,7 @@
           <w:u w:val="single"/>
           <w:lang w:val="en-GB"/>
         </w:rPr>
-        <w:t>0</w:t>
+        <w:t>5</w:t>
       </w:r>
       <w:r>
         <w:rPr>
@@ -5529,6 +5526,8 @@
       <w:r>
         <w:rPr>
           <w:rStyle w:val="CommentReference"/>
+          <w:sz w:val="22"/>
+          <w:szCs w:val="22"/>
           <w:lang w:val="en-GB"/>
         </w:rPr>
         <w:commentReference w:id="3"/>
@@ -5752,6 +5751,8 @@
       <w:r>
         <w:rPr>
           <w:rStyle w:val="CommentReference"/>
+          <w:sz w:val="22"/>
+          <w:szCs w:val="22"/>
           <w:lang w:val="en-GB"/>
         </w:rPr>
         <w:commentReference w:id="4"/>
@@ -5972,6 +5973,8 @@
       <w:r>
         <w:rPr>
           <w:rStyle w:val="CommentReference"/>
+          <w:sz w:val="22"/>
+          <w:szCs w:val="22"/>
           <w:lang w:val="en-GB"/>
         </w:rPr>
         <w:commentReference w:id="5"/>

</xml_diff>

<commit_message>
Minor revisions to W13 slides and adding bios to Syllabus and W1.
</commit_message>
<xml_diff>
--- a/Syllabus/DL_syllabus.docx
+++ b/Syllabus/DL_syllabus.docx
@@ -322,7 +322,20 @@
         <w:rPr>
           <w:lang w:val="en-GB"/>
         </w:rPr>
-        <w:t>XXX</w:t>
+        <w:t>Dileepa Fernando is a Lecturer in the Information Systems Technology and Design pillar at the Singapore University of Technology and Design (SUTD). Dileepa completed his Bachelor of Science in Engineering (BSc Eng) with a specialization in Computer Science and Engineering at the University of Moratuwa, Sri Lanka. Later, he obtained a PhD in Computer Science from the National University of Singapore, with a focus on utilizing model checking to ensure the game theory security of probabilistic protocols. Expanding his doctoral work, he led the secure machine learning project at HP-NTU corporate lab. Following his passion of teaching he started his teaching career in Sri Lanka Technological Campus (SLTC) and joined SUTD in 2023. His teaching experience in SUTD covers most parts of computer science including Software Engineering, Cyber Security and Artificial Intelligence.</w:t>
+      </w:r>
+    </w:p>
+    <w:p>
+      <w:pPr>
+        <w:rPr>
+          <w:lang w:val="en-GB"/>
+        </w:rPr>
+      </w:pPr>
+      <w:r>
+        <w:rPr>
+          <w:lang w:val="en-GB"/>
+        </w:rPr>
+        <w:t>Outside his professional life, he enjoys public speaking and holds the position of vice president membership at the Breakthrough Toastmasters Club, Singapore. He spends his leisure time singing and playing the guitar.</w:t>
       </w:r>
     </w:p>
     <w:p>
@@ -344,15 +357,21 @@
         </w:rPr>
         <w:t xml:space="preserve"> </w:t>
       </w:r>
-      <w:hyperlink r:id="rId9" w:tooltip="mailto:qun_song@sutd.edu.sg" w:history="1">
+      <w:hyperlink r:id="rId9" w:history="1">
         <w:r>
           <w:rPr>
             <w:rStyle w:val="Hyperlink"/>
             <w:lang w:val="en-GB"/>
           </w:rPr>
-          <w:t>XXX</w:t>
+          <w:t>dileepa_fernando@sutd.edu.sg</w:t>
         </w:r>
       </w:hyperlink>
+      <w:r>
+        <w:rPr>
+          <w:lang w:val="en-GB"/>
+        </w:rPr>
+        <w:t xml:space="preserve"> </w:t>
+      </w:r>
     </w:p>
     <w:p>
       <w:pPr>
@@ -374,63 +393,48 @@
         <w:t xml:space="preserve"> </w:t>
       </w:r>
       <w:r>
-        <w:rPr>
-          <w:lang w:val="en-GB"/>
-        </w:rPr>
-        <w:t>XXX</w:t>
-      </w:r>
-    </w:p>
-    <w:p>
-      <w:pPr>
-        <w:rPr>
-          <w:lang w:val="en-GB"/>
+        <w:t>1.402.24</w:t>
+      </w:r>
+      <w:r>
+        <w:rPr>
+          <w:lang w:val="en-GB"/>
+        </w:rPr>
+        <w:t>, email this professor first to arrange a meeting, in person or online.</w:t>
+      </w:r>
+    </w:p>
+    <w:p>
+      <w:pPr>
+        <w:rPr>
+          <w:lang w:val="fr-FR"/>
         </w:rPr>
       </w:pPr>
       <w:r>
         <w:rPr>
           <w:u w:val="single"/>
-          <w:lang w:val="en-GB"/>
+          <w:lang w:val="fr-FR"/>
         </w:rPr>
         <w:t>ISTD page:</w:t>
       </w:r>
       <w:r>
         <w:rPr>
-          <w:lang w:val="en-GB"/>
+          <w:lang w:val="fr-FR"/>
         </w:rPr>
         <w:t xml:space="preserve"> </w:t>
       </w:r>
-      <w:hyperlink r:id="rId10" w:tgtFrame="_blank" w:tooltip="https://istd.sutd.edu.sg/people/faculty/qun-song" w:history="1">
+      <w:hyperlink r:id="rId10" w:history="1">
         <w:r>
           <w:rPr>
             <w:rStyle w:val="Hyperlink"/>
-            <w:lang w:val="en-GB"/>
+            <w:lang w:val="fr-FR"/>
           </w:rPr>
-          <w:t>XXX</w:t>
+          <w:t>https://www.sutd.edu.sg/profile/dileepa-fernando/</w:t>
         </w:r>
       </w:hyperlink>
-    </w:p>
-    <w:p>
-      <w:pPr>
-        <w:rPr>
-          <w:lang w:val="en-GB"/>
-        </w:rPr>
-      </w:pPr>
-    </w:p>
-    <w:p>
-      <w:pPr>
-        <w:rPr>
-          <w:rFonts w:asciiTheme="majorHAnsi" w:eastAsiaTheme="majorEastAsia" w:hAnsiTheme="majorHAnsi" w:cstheme="majorBidi"/>
-          <w:color w:val="2E74B5" w:themeColor="accent1" w:themeShade="BF"/>
-          <w:sz w:val="26"/>
-          <w:szCs w:val="26"/>
-          <w:lang w:val="en-GB"/>
-        </w:rPr>
-      </w:pPr>
-      <w:r>
-        <w:rPr>
-          <w:lang w:val="en-GB"/>
-        </w:rPr>
-        <w:br w:type="page"/>
+      <w:r>
+        <w:rPr>
+          <w:lang w:val="fr-FR"/>
+        </w:rPr>
+        <w:t xml:space="preserve"> </w:t>
       </w:r>
     </w:p>
     <w:p>
@@ -479,78 +483,6 @@
         </w:rPr>
         <w:t>XXX</w:t>
       </w:r>
-    </w:p>
-    <w:p>
-      <w:pPr>
-        <w:pStyle w:val="NormalWeb"/>
-        <w:spacing w:before="0" w:beforeAutospacing="0" w:after="0" w:afterAutospacing="0"/>
-        <w:rPr>
-          <w:rFonts w:ascii="Calibri" w:hAnsi="Calibri" w:cs="Calibri"/>
-          <w:sz w:val="22"/>
-          <w:szCs w:val="22"/>
-          <w:lang w:val="fr-FR"/>
-        </w:rPr>
-      </w:pPr>
-    </w:p>
-    <w:p>
-      <w:pPr>
-        <w:rPr>
-          <w:lang w:val="fr-FR"/>
-        </w:rPr>
-      </w:pPr>
-    </w:p>
-    <w:p>
-      <w:pPr>
-        <w:pStyle w:val="Heading2"/>
-        <w:rPr>
-          <w:lang w:val="fr-FR"/>
-        </w:rPr>
-      </w:pPr>
-      <w:r>
-        <w:rPr>
-          <w:lang w:val="fr-FR"/>
-        </w:rPr>
-        <w:t>XXX</w:t>
-      </w:r>
-      <w:r>
-        <w:rPr>
-          <w:lang w:val="fr-FR"/>
-        </w:rPr>
-        <w:t xml:space="preserve"> </w:t>
-      </w:r>
-      <w:r>
-        <w:rPr>
-          <w:lang w:val="fr-FR"/>
-        </w:rPr>
-        <w:t>(TA)</w:t>
-      </w:r>
-    </w:p>
-    <w:p>
-      <w:pPr>
-        <w:rPr>
-          <w:lang w:val="fr-FR"/>
-        </w:rPr>
-      </w:pPr>
-    </w:p>
-    <w:p>
-      <w:pPr>
-        <w:rPr>
-          <w:lang w:val="en-GB"/>
-        </w:rPr>
-      </w:pPr>
-      <w:r>
-        <w:rPr>
-          <w:lang w:val="en-GB"/>
-        </w:rPr>
-        <w:t>XXX</w:t>
-      </w:r>
-    </w:p>
-    <w:p>
-      <w:pPr>
-        <w:rPr>
-          <w:lang w:val="en-GB"/>
-        </w:rPr>
-      </w:pPr>
     </w:p>
     <w:p>
       <w:pPr>
@@ -9986,7 +9918,6 @@
   <w:style w:type="character" w:default="1" w:styleId="DefaultParagraphFont">
     <w:name w:val="Default Paragraph Font"/>
     <w:uiPriority w:val="1"/>
-    <w:semiHidden/>
     <w:unhideWhenUsed/>
   </w:style>
   <w:style w:type="table" w:default="1" w:styleId="TableNormal">

</xml_diff>

<commit_message>
Added minor changes to W1-4 lecture notes, adding instructor bios
</commit_message>
<xml_diff>
--- a/Syllabus/DL_syllabus.docx
+++ b/Syllabus/DL_syllabus.docx
@@ -6140,6 +6140,33 @@
           <w:lang w:val="en-GB"/>
         </w:rPr>
       </w:pPr>
+    </w:p>
+    <w:p>
+      <w:pPr>
+        <w:rPr>
+          <w:lang w:val="en-GB"/>
+        </w:rPr>
+      </w:pPr>
+      <w:r>
+        <w:rPr>
+          <w:b/>
+          <w:bCs/>
+          <w:lang w:val="en-GB"/>
+        </w:rPr>
+        <w:t>Also a note for audit students:</w:t>
+      </w:r>
+      <w:r>
+        <w:rPr>
+          <w:lang w:val="en-GB"/>
+        </w:rPr>
+        <w:t xml:space="preserve"> A successful audit will require attending classes and submitting at least half of the homeworks. </w:t>
+      </w:r>
+      <w:r>
+        <w:rPr>
+          <w:lang w:val="en-GB"/>
+        </w:rPr>
+        <w:t>Projects and exams are not required, but we leave it to the students to decide if they want to participate in those or not.</w:t>
+      </w:r>
     </w:p>
     <w:sectPr>
       <w:headerReference w:type="even" r:id="rId20"/>
@@ -9918,6 +9945,7 @@
   <w:style w:type="character" w:default="1" w:styleId="DefaultParagraphFont">
     <w:name w:val="Default Paragraph Font"/>
     <w:uiPriority w:val="1"/>
+    <w:semiHidden/>
     <w:unhideWhenUsed/>
   </w:style>
   <w:style w:type="table" w:default="1" w:styleId="TableNormal">

</xml_diff>

<commit_message>
Done teaching W3 and W4.
</commit_message>
<xml_diff>
--- a/Syllabus/DL_syllabus.docx
+++ b/Syllabus/DL_syllabus.docx
@@ -6187,32 +6187,37 @@
         <w:rPr>
           <w:lang w:val="en-GB"/>
         </w:rPr>
-        <w:t>End of Week 12</w:t>
-      </w:r>
-      <w:r>
-        <w:rPr>
-          <w:lang w:val="en-GB"/>
-        </w:rPr>
-        <w:t xml:space="preserve">, </w:t>
-      </w:r>
-      <w:r>
-        <w:rPr>
-          <w:lang w:val="en-GB"/>
-        </w:rPr>
-        <w:t>Friday 17</w:t>
-      </w:r>
-      <w:r>
-        <w:rPr>
-          <w:vertAlign w:val="superscript"/>
-          <w:lang w:val="en-GB"/>
-        </w:rPr>
-        <w:t>th</w:t>
-      </w:r>
-      <w:r>
-        <w:rPr>
-          <w:lang w:val="en-GB"/>
-        </w:rPr>
-        <w:t xml:space="preserve"> April, 11.59pm.</w:t>
+        <w:t>e</w:t>
+      </w:r>
+      <w:r>
+        <w:rPr>
+          <w:lang w:val="en-GB"/>
+        </w:rPr>
+        <w:t>nd of Week 12</w:t>
+      </w:r>
+      <w:r>
+        <w:rPr>
+          <w:lang w:val="en-GB"/>
+        </w:rPr>
+        <w:t>,</w:t>
+      </w:r>
+      <w:r>
+        <w:rPr>
+          <w:lang w:val="en-GB"/>
+        </w:rPr>
+        <w:t xml:space="preserve"> as per project instructions</w:t>
+      </w:r>
+      <w:r>
+        <w:rPr>
+          <w:lang w:val="en-GB"/>
+        </w:rPr>
+        <w:t>.</w:t>
+      </w:r>
+      <w:r>
+        <w:rPr>
+          <w:lang w:val="en-GB"/>
+        </w:rPr>
+        <w:t xml:space="preserve"> A proposal submission might also be required, at an earlier date tan W12.</w:t>
       </w:r>
     </w:p>
     <w:p>
@@ -6230,7 +6235,13 @@
         <w:rPr>
           <w:lang w:val="en-GB"/>
         </w:rPr>
-        <w:t>Problem statement can be freely decided by students, submit your project proposal.</w:t>
+        <w:t>Problem statement can be freely decided by students</w:t>
+      </w:r>
+      <w:r>
+        <w:rPr>
+          <w:lang w:val="en-GB"/>
+        </w:rPr>
+        <w:t>, as per project instructions.</w:t>
       </w:r>
     </w:p>
     <w:p>
@@ -6241,36 +6252,6 @@
           <w:numId w:val="8"/>
         </w:numPr>
         <w:rPr>
-          <w:lang w:val="en-GB"/>
-        </w:rPr>
-      </w:pPr>
-      <w:r>
-        <w:rPr>
-          <w:lang w:val="en-GB"/>
-        </w:rPr>
-        <w:t>If you feel uninspired for this project, your professors will suggest a project</w:t>
-      </w:r>
-      <w:r>
-        <w:rPr>
-          <w:lang w:val="en-GB"/>
-        </w:rPr>
-        <w:t xml:space="preserve"> idea</w:t>
-      </w:r>
-      <w:r>
-        <w:rPr>
-          <w:lang w:val="en-GB"/>
-        </w:rPr>
-        <w:t>.</w:t>
-      </w:r>
-    </w:p>
-    <w:p>
-      <w:pPr>
-        <w:pStyle w:val="ListParagraph"/>
-        <w:numPr>
-          <w:ilvl w:val="0"/>
-          <w:numId w:val="8"/>
-        </w:numPr>
-        <w:rPr>
           <w:b/>
           <w:bCs/>
           <w:lang w:val="en-GB"/>
@@ -6282,7 +6263,23 @@
           <w:bCs/>
           <w:lang w:val="en-GB"/>
         </w:rPr>
-        <w:t>No extensions will be given for projects.</w:t>
+        <w:t>No extensions will be given for projects</w:t>
+      </w:r>
+      <w:r>
+        <w:rPr>
+          <w:b/>
+          <w:bCs/>
+          <w:lang w:val="en-GB"/>
+        </w:rPr>
+        <w:t>, as professors need time to review your projects before presentations on W13</w:t>
+      </w:r>
+      <w:r>
+        <w:rPr>
+          <w:b/>
+          <w:bCs/>
+          <w:lang w:val="en-GB"/>
+        </w:rPr>
+        <w:t>.</w:t>
       </w:r>
     </w:p>
     <w:p>

</xml_diff>

<commit_message>
Changes to syllabus (LLM usage).
</commit_message>
<xml_diff>
--- a/Syllabus/DL_syllabus.docx
+++ b/Syllabus/DL_syllabus.docx
@@ -60,7 +60,21 @@
         <w:rPr>
           <w:lang w:val="fr-FR"/>
         </w:rPr>
-        <w:t xml:space="preserve">, last update: </w:t>
+        <w:t xml:space="preserve">, last </w:t>
+      </w:r>
+      <w:proofErr w:type="gramStart"/>
+      <w:r>
+        <w:rPr>
+          <w:lang w:val="fr-FR"/>
+        </w:rPr>
+        <w:t>update:</w:t>
+      </w:r>
+      <w:proofErr w:type="gramEnd"/>
+      <w:r>
+        <w:rPr>
+          <w:lang w:val="fr-FR"/>
+        </w:rPr>
+        <w:t xml:space="preserve"> </w:t>
       </w:r>
       <w:r>
         <w:rPr>
@@ -265,8 +279,17 @@
           <w:u w:val="single"/>
           <w:lang w:val="fr-FR"/>
         </w:rPr>
-        <w:t>ISTD page:</w:t>
-      </w:r>
+        <w:t xml:space="preserve">ISTD </w:t>
+      </w:r>
+      <w:proofErr w:type="gramStart"/>
+      <w:r>
+        <w:rPr>
+          <w:u w:val="single"/>
+          <w:lang w:val="fr-FR"/>
+        </w:rPr>
+        <w:t>page:</w:t>
+      </w:r>
+      <w:proofErr w:type="gramEnd"/>
       <w:r>
         <w:rPr>
           <w:lang w:val="fr-FR"/>
@@ -425,8 +448,17 @@
           <w:u w:val="single"/>
           <w:lang w:val="fr-FR"/>
         </w:rPr>
-        <w:t>ISTD page:</w:t>
-      </w:r>
+        <w:t xml:space="preserve">ISTD </w:t>
+      </w:r>
+      <w:proofErr w:type="gramStart"/>
+      <w:r>
+        <w:rPr>
+          <w:u w:val="single"/>
+          <w:lang w:val="fr-FR"/>
+        </w:rPr>
+        <w:t>page:</w:t>
+      </w:r>
+      <w:proofErr w:type="gramEnd"/>
       <w:r>
         <w:rPr>
           <w:lang w:val="fr-FR"/>
@@ -489,24 +521,60 @@
           <w:lang w:val="en-GB" w:eastAsia="en-GB"/>
         </w:rPr>
       </w:pPr>
+      <w:proofErr w:type="spellStart"/>
       <w:r>
         <w:rPr>
           <w:lang w:val="en-GB" w:eastAsia="en-GB"/>
         </w:rPr>
-        <w:t xml:space="preserve">Kunrong Li, a PhD student under the ISTD pillar. My research interests include distributed systems, recommender systems, and LLM, with a focus on applying these techniques in real-world production environments. </w:t>
-      </w:r>
-    </w:p>
-    <w:p>
-      <w:pPr>
+        <w:t>Kunrong</w:t>
+      </w:r>
+      <w:proofErr w:type="spellEnd"/>
+      <w:r>
         <w:rPr>
           <w:lang w:val="en-GB" w:eastAsia="en-GB"/>
         </w:rPr>
-      </w:pPr>
-      <w:r>
+        <w:t xml:space="preserve"> Li, a PhD student under the ISTD pillar. My research interests include distributed systems, recommender systems, and LLM, with a focus on applying these techniques in real-world production environments. </w:t>
+      </w:r>
+    </w:p>
+    <w:p>
+      <w:pPr>
         <w:rPr>
           <w:lang w:val="en-GB" w:eastAsia="en-GB"/>
         </w:rPr>
-        <w:t>Our TA will be helping with designing and grading homeworks through the term. You may approach her via email in case of questions about homeworks.</w:t>
+      </w:pPr>
+      <w:r>
+        <w:rPr>
+          <w:lang w:val="en-GB" w:eastAsia="en-GB"/>
+        </w:rPr>
+        <w:t xml:space="preserve">Our TA will be helping with designing and grading </w:t>
+      </w:r>
+      <w:proofErr w:type="spellStart"/>
+      <w:r>
+        <w:rPr>
+          <w:lang w:val="en-GB" w:eastAsia="en-GB"/>
+        </w:rPr>
+        <w:t>homeworks</w:t>
+      </w:r>
+      <w:proofErr w:type="spellEnd"/>
+      <w:r>
+        <w:rPr>
+          <w:lang w:val="en-GB" w:eastAsia="en-GB"/>
+        </w:rPr>
+        <w:t xml:space="preserve"> through the term. You may approach her via email in case of questions about </w:t>
+      </w:r>
+      <w:proofErr w:type="spellStart"/>
+      <w:r>
+        <w:rPr>
+          <w:lang w:val="en-GB" w:eastAsia="en-GB"/>
+        </w:rPr>
+        <w:t>homeworks</w:t>
+      </w:r>
+      <w:proofErr w:type="spellEnd"/>
+      <w:r>
+        <w:rPr>
+          <w:lang w:val="en-GB" w:eastAsia="en-GB"/>
+        </w:rPr>
+        <w:t>.</w:t>
       </w:r>
     </w:p>
     <w:p>
@@ -926,8 +994,16 @@
         <w:rPr>
           <w:lang w:val="en-GB"/>
         </w:rPr>
-        <w:t xml:space="preserve"> Numpy</w:t>
-      </w:r>
+        <w:t xml:space="preserve"> </w:t>
+      </w:r>
+      <w:proofErr w:type="spellStart"/>
+      <w:r>
+        <w:rPr>
+          <w:lang w:val="en-GB"/>
+        </w:rPr>
+        <w:t>Numpy</w:t>
+      </w:r>
+      <w:proofErr w:type="spellEnd"/>
       <w:r>
         <w:rPr>
           <w:lang w:val="en-GB"/>
@@ -946,11 +1022,19 @@
         </w:rPr>
         <w:t xml:space="preserve"> </w:t>
       </w:r>
-      <w:r>
-        <w:rPr>
-          <w:lang w:val="en-GB"/>
-        </w:rPr>
-        <w:t>Scipy and Scikit-Learn,</w:t>
+      <w:proofErr w:type="spellStart"/>
+      <w:r>
+        <w:rPr>
+          <w:lang w:val="en-GB"/>
+        </w:rPr>
+        <w:t>Scipy</w:t>
+      </w:r>
+      <w:proofErr w:type="spellEnd"/>
+      <w:r>
+        <w:rPr>
+          <w:lang w:val="en-GB"/>
+        </w:rPr>
+        <w:t xml:space="preserve"> and Scikit-Learn,</w:t>
       </w:r>
     </w:p>
     <w:p>
@@ -970,26 +1054,50 @@
         <w:rPr>
           <w:lang w:val="en-GB"/>
         </w:rPr>
-        <w:t xml:space="preserve"> PyTorch</w:t>
-      </w:r>
+        <w:t xml:space="preserve"> </w:t>
+      </w:r>
+      <w:proofErr w:type="spellStart"/>
+      <w:r>
+        <w:rPr>
+          <w:lang w:val="en-GB"/>
+        </w:rPr>
+        <w:t>PyTorch</w:t>
+      </w:r>
+      <w:proofErr w:type="spellEnd"/>
       <w:r>
         <w:rPr>
           <w:lang w:val="en-GB"/>
         </w:rPr>
         <w:t xml:space="preserve">, </w:t>
       </w:r>
-      <w:r>
-        <w:rPr>
-          <w:lang w:val="en-GB"/>
-        </w:rPr>
-        <w:t>TorchVision,</w:t>
-      </w:r>
-      <w:r>
-        <w:rPr>
-          <w:lang w:val="en-GB"/>
-        </w:rPr>
-        <w:t xml:space="preserve"> and TorchMetrics</w:t>
-      </w:r>
+      <w:proofErr w:type="spellStart"/>
+      <w:r>
+        <w:rPr>
+          <w:lang w:val="en-GB"/>
+        </w:rPr>
+        <w:t>TorchVision</w:t>
+      </w:r>
+      <w:proofErr w:type="spellEnd"/>
+      <w:r>
+        <w:rPr>
+          <w:lang w:val="en-GB"/>
+        </w:rPr>
+        <w:t>,</w:t>
+      </w:r>
+      <w:r>
+        <w:rPr>
+          <w:lang w:val="en-GB"/>
+        </w:rPr>
+        <w:t xml:space="preserve"> and </w:t>
+      </w:r>
+      <w:proofErr w:type="spellStart"/>
+      <w:r>
+        <w:rPr>
+          <w:lang w:val="en-GB"/>
+        </w:rPr>
+        <w:t>TorchMetrics</w:t>
+      </w:r>
+      <w:proofErr w:type="spellEnd"/>
     </w:p>
     <w:p>
       <w:pPr>
@@ -1028,7 +1136,21 @@
         <w:rPr>
           <w:lang w:val="en-GB"/>
         </w:rPr>
-        <w:t xml:space="preserve"> H5PY, Networkx and Gym,</w:t>
+        <w:t xml:space="preserve"> H5PY, </w:t>
+      </w:r>
+      <w:proofErr w:type="spellStart"/>
+      <w:r>
+        <w:rPr>
+          <w:lang w:val="en-GB"/>
+        </w:rPr>
+        <w:t>Networkx</w:t>
+      </w:r>
+      <w:proofErr w:type="spellEnd"/>
+      <w:r>
+        <w:rPr>
+          <w:lang w:val="en-GB"/>
+        </w:rPr>
+        <w:t xml:space="preserve"> and Gym,</w:t>
       </w:r>
     </w:p>
     <w:p>
@@ -1061,7 +1183,35 @@
         <w:rPr>
           <w:lang w:val="en-GB"/>
         </w:rPr>
-        <w:t>There is no need to get familiar with PyTorch before the course, as it will be covered in class. Getting familiar with it beforehand, however, will never hurt. Professors will often refer to the PyTorch documentation and tutorials for demos (https://pytorch.org/tutorials/).</w:t>
+        <w:t xml:space="preserve">There is no need to get familiar with </w:t>
+      </w:r>
+      <w:proofErr w:type="spellStart"/>
+      <w:r>
+        <w:rPr>
+          <w:lang w:val="en-GB"/>
+        </w:rPr>
+        <w:t>PyTorch</w:t>
+      </w:r>
+      <w:proofErr w:type="spellEnd"/>
+      <w:r>
+        <w:rPr>
+          <w:lang w:val="en-GB"/>
+        </w:rPr>
+        <w:t xml:space="preserve"> before the course, as it will be covered in class. Getting familiar with it beforehand, however, will never hurt. Professors will often refer to the </w:t>
+      </w:r>
+      <w:proofErr w:type="spellStart"/>
+      <w:r>
+        <w:rPr>
+          <w:lang w:val="en-GB"/>
+        </w:rPr>
+        <w:t>PyTorch</w:t>
+      </w:r>
+      <w:proofErr w:type="spellEnd"/>
+      <w:r>
+        <w:rPr>
+          <w:lang w:val="en-GB"/>
+        </w:rPr>
+        <w:t xml:space="preserve"> documentation and tutorials for demos (https://pytorch.org/tutorials/).</w:t>
       </w:r>
     </w:p>
     <w:p>
@@ -1086,7 +1236,21 @@
         <w:rPr>
           <w:lang w:val="en-GB"/>
         </w:rPr>
-        <w:t>expect some Jupyter Notebooks for in-class demos from your professors.</w:t>
+        <w:t xml:space="preserve">expect some </w:t>
+      </w:r>
+      <w:proofErr w:type="spellStart"/>
+      <w:r>
+        <w:rPr>
+          <w:lang w:val="en-GB"/>
+        </w:rPr>
+        <w:t>Jupyter</w:t>
+      </w:r>
+      <w:proofErr w:type="spellEnd"/>
+      <w:r>
+        <w:rPr>
+          <w:lang w:val="en-GB"/>
+        </w:rPr>
+        <w:t xml:space="preserve"> Notebooks for in-class demos from your professors.</w:t>
       </w:r>
     </w:p>
     <w:p>
@@ -1459,7 +1623,25 @@
                 <w:color w:val="000000"/>
                 <w:lang w:val="en-GB" w:eastAsia="en-GB"/>
               </w:rPr>
-              <w:t>Introduction to course, technical pre-requisites, ML jargon, ML problems, Linear Regression in Numpy and Scikit Learn, Gradient Descent</w:t>
+              <w:t xml:space="preserve">Introduction to course, technical pre-requisites, ML jargon, ML problems, Linear Regression in </w:t>
+            </w:r>
+            <w:proofErr w:type="spellStart"/>
+            <w:r>
+              <w:rPr>
+                <w:rFonts w:ascii="Calibri" w:eastAsia="Times New Roman" w:hAnsi="Calibri" w:cs="Calibri"/>
+                <w:color w:val="000000"/>
+                <w:lang w:val="en-GB" w:eastAsia="en-GB"/>
+              </w:rPr>
+              <w:t>Numpy</w:t>
+            </w:r>
+            <w:proofErr w:type="spellEnd"/>
+            <w:r>
+              <w:rPr>
+                <w:rFonts w:ascii="Calibri" w:eastAsia="Times New Roman" w:hAnsi="Calibri" w:cs="Calibri"/>
+                <w:color w:val="000000"/>
+                <w:lang w:val="en-GB" w:eastAsia="en-GB"/>
+              </w:rPr>
+              <w:t xml:space="preserve"> and Scikit Learn, Gradient Descent</w:t>
             </w:r>
           </w:p>
         </w:tc>
@@ -1492,7 +1674,25 @@
                 <w:color w:val="000000"/>
                 <w:lang w:val="en-GB" w:eastAsia="en-GB"/>
               </w:rPr>
-              <w:t>Polynomial Regresion, Overfitting vs. Underfitting, Train-Test Split, Regularization and Ridge/Lasso Regression</w:t>
+              <w:t xml:space="preserve">Polynomial </w:t>
+            </w:r>
+            <w:proofErr w:type="spellStart"/>
+            <w:r>
+              <w:rPr>
+                <w:rFonts w:ascii="Calibri" w:eastAsia="Times New Roman" w:hAnsi="Calibri" w:cs="Calibri"/>
+                <w:color w:val="000000"/>
+                <w:lang w:val="en-GB" w:eastAsia="en-GB"/>
+              </w:rPr>
+              <w:t>Regresion</w:t>
+            </w:r>
+            <w:proofErr w:type="spellEnd"/>
+            <w:r>
+              <w:rPr>
+                <w:rFonts w:ascii="Calibri" w:eastAsia="Times New Roman" w:hAnsi="Calibri" w:cs="Calibri"/>
+                <w:color w:val="000000"/>
+                <w:lang w:val="en-GB" w:eastAsia="en-GB"/>
+              </w:rPr>
+              <w:t>, Overfitting vs. Underfitting, Train-Test Split, Regularization and Ridge/Lasso Regression</w:t>
             </w:r>
           </w:p>
         </w:tc>
@@ -1525,7 +1725,25 @@
                 <w:color w:val="000000"/>
                 <w:lang w:val="en-GB" w:eastAsia="en-GB"/>
               </w:rPr>
-              <w:t>Logistic Regression, Neural Networks in Biology, Implementation of a Shallow Neural Network in Numpy, with manual Forward and Backward pass</w:t>
+              <w:t xml:space="preserve">Logistic Regression, Neural Networks in Biology, Implementation of a Shallow Neural Network in </w:t>
+            </w:r>
+            <w:proofErr w:type="spellStart"/>
+            <w:r>
+              <w:rPr>
+                <w:rFonts w:ascii="Calibri" w:eastAsia="Times New Roman" w:hAnsi="Calibri" w:cs="Calibri"/>
+                <w:color w:val="000000"/>
+                <w:lang w:val="en-GB" w:eastAsia="en-GB"/>
+              </w:rPr>
+              <w:t>Numpy</w:t>
+            </w:r>
+            <w:proofErr w:type="spellEnd"/>
+            <w:r>
+              <w:rPr>
+                <w:rFonts w:ascii="Calibri" w:eastAsia="Times New Roman" w:hAnsi="Calibri" w:cs="Calibri"/>
+                <w:color w:val="000000"/>
+                <w:lang w:val="en-GB" w:eastAsia="en-GB"/>
+              </w:rPr>
+              <w:t>, with manual Forward and Backward pass</w:t>
             </w:r>
           </w:p>
         </w:tc>
@@ -1701,7 +1919,43 @@
                 <w:color w:val="000000"/>
                 <w:lang w:val="en-GB" w:eastAsia="en-GB"/>
               </w:rPr>
-              <w:t>A deep dive into Gradient Descent, Advanced Optimizers (AdaGrad, RMSProp, Adam), Mini-batch Stochastic Gradient Descent and the No Free Lunch Theorem</w:t>
+              <w:t>A deep dive into Gradient Descent, Advanced Optimizers (</w:t>
+            </w:r>
+            <w:proofErr w:type="spellStart"/>
+            <w:r>
+              <w:rPr>
+                <w:rFonts w:ascii="Calibri" w:eastAsia="Times New Roman" w:hAnsi="Calibri" w:cs="Calibri"/>
+                <w:color w:val="000000"/>
+                <w:lang w:val="en-GB" w:eastAsia="en-GB"/>
+              </w:rPr>
+              <w:t>AdaGrad</w:t>
+            </w:r>
+            <w:proofErr w:type="spellEnd"/>
+            <w:r>
+              <w:rPr>
+                <w:rFonts w:ascii="Calibri" w:eastAsia="Times New Roman" w:hAnsi="Calibri" w:cs="Calibri"/>
+                <w:color w:val="000000"/>
+                <w:lang w:val="en-GB" w:eastAsia="en-GB"/>
+              </w:rPr>
+              <w:t xml:space="preserve">, </w:t>
+            </w:r>
+            <w:proofErr w:type="spellStart"/>
+            <w:r>
+              <w:rPr>
+                <w:rFonts w:ascii="Calibri" w:eastAsia="Times New Roman" w:hAnsi="Calibri" w:cs="Calibri"/>
+                <w:color w:val="000000"/>
+                <w:lang w:val="en-GB" w:eastAsia="en-GB"/>
+              </w:rPr>
+              <w:t>RMSProp</w:t>
+            </w:r>
+            <w:proofErr w:type="spellEnd"/>
+            <w:r>
+              <w:rPr>
+                <w:rFonts w:ascii="Calibri" w:eastAsia="Times New Roman" w:hAnsi="Calibri" w:cs="Calibri"/>
+                <w:color w:val="000000"/>
+                <w:lang w:val="en-GB" w:eastAsia="en-GB"/>
+              </w:rPr>
+              <w:t>, Adam), Mini-batch Stochastic Gradient Descent and the No Free Lunch Theorem</w:t>
             </w:r>
           </w:p>
         </w:tc>
@@ -1813,7 +2067,29 @@
                 <w:color w:val="000000"/>
                 <w:lang w:val="en-GB" w:eastAsia="en-GB"/>
               </w:rPr>
-              <w:t>Introduction to the PyTorch Framework</w:t>
+              <w:t xml:space="preserve">Introduction to the </w:t>
+            </w:r>
+            <w:proofErr w:type="spellStart"/>
+            <w:r>
+              <w:rPr>
+                <w:rFonts w:ascii="Calibri" w:eastAsia="Times New Roman" w:hAnsi="Calibri" w:cs="Calibri"/>
+                <w:b/>
+                <w:bCs/>
+                <w:color w:val="000000"/>
+                <w:lang w:val="en-GB" w:eastAsia="en-GB"/>
+              </w:rPr>
+              <w:t>PyTorch</w:t>
+            </w:r>
+            <w:proofErr w:type="spellEnd"/>
+            <w:r>
+              <w:rPr>
+                <w:rFonts w:ascii="Calibri" w:eastAsia="Times New Roman" w:hAnsi="Calibri" w:cs="Calibri"/>
+                <w:b/>
+                <w:bCs/>
+                <w:color w:val="000000"/>
+                <w:lang w:val="en-GB" w:eastAsia="en-GB"/>
+              </w:rPr>
+              <w:t xml:space="preserve"> Framework</w:t>
             </w:r>
           </w:p>
         </w:tc>
@@ -1877,8 +2153,90 @@
                 <w:color w:val="000000"/>
                 <w:lang w:val="en-GB" w:eastAsia="en-GB"/>
               </w:rPr>
-              <w:t>The PyTorch Framework and its benefits compared to Numpy, the PyToch tensor object and its uses, converting our Shallow Neural Network from Numpy to PyTorch</w:t>
-            </w:r>
+              <w:t xml:space="preserve">The </w:t>
+            </w:r>
+            <w:proofErr w:type="spellStart"/>
+            <w:r>
+              <w:rPr>
+                <w:rFonts w:ascii="Calibri" w:eastAsia="Times New Roman" w:hAnsi="Calibri" w:cs="Calibri"/>
+                <w:color w:val="000000"/>
+                <w:lang w:val="en-GB" w:eastAsia="en-GB"/>
+              </w:rPr>
+              <w:t>PyTorch</w:t>
+            </w:r>
+            <w:proofErr w:type="spellEnd"/>
+            <w:r>
+              <w:rPr>
+                <w:rFonts w:ascii="Calibri" w:eastAsia="Times New Roman" w:hAnsi="Calibri" w:cs="Calibri"/>
+                <w:color w:val="000000"/>
+                <w:lang w:val="en-GB" w:eastAsia="en-GB"/>
+              </w:rPr>
+              <w:t xml:space="preserve"> Framework and its benefits compared to </w:t>
+            </w:r>
+            <w:proofErr w:type="spellStart"/>
+            <w:r>
+              <w:rPr>
+                <w:rFonts w:ascii="Calibri" w:eastAsia="Times New Roman" w:hAnsi="Calibri" w:cs="Calibri"/>
+                <w:color w:val="000000"/>
+                <w:lang w:val="en-GB" w:eastAsia="en-GB"/>
+              </w:rPr>
+              <w:t>Numpy</w:t>
+            </w:r>
+            <w:proofErr w:type="spellEnd"/>
+            <w:r>
+              <w:rPr>
+                <w:rFonts w:ascii="Calibri" w:eastAsia="Times New Roman" w:hAnsi="Calibri" w:cs="Calibri"/>
+                <w:color w:val="000000"/>
+                <w:lang w:val="en-GB" w:eastAsia="en-GB"/>
+              </w:rPr>
+              <w:t xml:space="preserve">, the </w:t>
+            </w:r>
+            <w:proofErr w:type="spellStart"/>
+            <w:r>
+              <w:rPr>
+                <w:rFonts w:ascii="Calibri" w:eastAsia="Times New Roman" w:hAnsi="Calibri" w:cs="Calibri"/>
+                <w:color w:val="000000"/>
+                <w:lang w:val="en-GB" w:eastAsia="en-GB"/>
+              </w:rPr>
+              <w:t>PyToch</w:t>
+            </w:r>
+            <w:proofErr w:type="spellEnd"/>
+            <w:r>
+              <w:rPr>
+                <w:rFonts w:ascii="Calibri" w:eastAsia="Times New Roman" w:hAnsi="Calibri" w:cs="Calibri"/>
+                <w:color w:val="000000"/>
+                <w:lang w:val="en-GB" w:eastAsia="en-GB"/>
+              </w:rPr>
+              <w:t xml:space="preserve"> tensor object and its uses, converting our Shallow Neural Network from </w:t>
+            </w:r>
+            <w:proofErr w:type="spellStart"/>
+            <w:r>
+              <w:rPr>
+                <w:rFonts w:ascii="Calibri" w:eastAsia="Times New Roman" w:hAnsi="Calibri" w:cs="Calibri"/>
+                <w:color w:val="000000"/>
+                <w:lang w:val="en-GB" w:eastAsia="en-GB"/>
+              </w:rPr>
+              <w:t>Numpy</w:t>
+            </w:r>
+            <w:proofErr w:type="spellEnd"/>
+            <w:r>
+              <w:rPr>
+                <w:rFonts w:ascii="Calibri" w:eastAsia="Times New Roman" w:hAnsi="Calibri" w:cs="Calibri"/>
+                <w:color w:val="000000"/>
+                <w:lang w:val="en-GB" w:eastAsia="en-GB"/>
+              </w:rPr>
+              <w:t xml:space="preserve"> to </w:t>
+            </w:r>
+            <w:proofErr w:type="spellStart"/>
+            <w:r>
+              <w:rPr>
+                <w:rFonts w:ascii="Calibri" w:eastAsia="Times New Roman" w:hAnsi="Calibri" w:cs="Calibri"/>
+                <w:color w:val="000000"/>
+                <w:lang w:val="en-GB" w:eastAsia="en-GB"/>
+              </w:rPr>
+              <w:t>PyTorch</w:t>
+            </w:r>
+            <w:proofErr w:type="spellEnd"/>
           </w:p>
         </w:tc>
         <w:tc>
@@ -1910,7 +2268,97 @@
                 <w:color w:val="000000"/>
                 <w:lang w:val="en-GB" w:eastAsia="en-GB"/>
               </w:rPr>
-              <w:t>Converting our Shallow Neural Network from Numpy to PyTorch (part 2 and end), AutoGrad and BackPropagation in PyTorch, GPU Acceleration</w:t>
+              <w:t xml:space="preserve">Converting our Shallow Neural Network from </w:t>
+            </w:r>
+            <w:proofErr w:type="spellStart"/>
+            <w:r>
+              <w:rPr>
+                <w:rFonts w:ascii="Calibri" w:eastAsia="Times New Roman" w:hAnsi="Calibri" w:cs="Calibri"/>
+                <w:color w:val="000000"/>
+                <w:lang w:val="en-GB" w:eastAsia="en-GB"/>
+              </w:rPr>
+              <w:t>Numpy</w:t>
+            </w:r>
+            <w:proofErr w:type="spellEnd"/>
+            <w:r>
+              <w:rPr>
+                <w:rFonts w:ascii="Calibri" w:eastAsia="Times New Roman" w:hAnsi="Calibri" w:cs="Calibri"/>
+                <w:color w:val="000000"/>
+                <w:lang w:val="en-GB" w:eastAsia="en-GB"/>
+              </w:rPr>
+              <w:t xml:space="preserve"> to </w:t>
+            </w:r>
+            <w:proofErr w:type="spellStart"/>
+            <w:r>
+              <w:rPr>
+                <w:rFonts w:ascii="Calibri" w:eastAsia="Times New Roman" w:hAnsi="Calibri" w:cs="Calibri"/>
+                <w:color w:val="000000"/>
+                <w:lang w:val="en-GB" w:eastAsia="en-GB"/>
+              </w:rPr>
+              <w:t>PyTorch</w:t>
+            </w:r>
+            <w:proofErr w:type="spellEnd"/>
+            <w:r>
+              <w:rPr>
+                <w:rFonts w:ascii="Calibri" w:eastAsia="Times New Roman" w:hAnsi="Calibri" w:cs="Calibri"/>
+                <w:color w:val="000000"/>
+                <w:lang w:val="en-GB" w:eastAsia="en-GB"/>
+              </w:rPr>
+              <w:t xml:space="preserve"> (part 2 and end), </w:t>
+            </w:r>
+            <w:proofErr w:type="spellStart"/>
+            <w:r>
+              <w:rPr>
+                <w:rFonts w:ascii="Calibri" w:eastAsia="Times New Roman" w:hAnsi="Calibri" w:cs="Calibri"/>
+                <w:color w:val="000000"/>
+                <w:lang w:val="en-GB" w:eastAsia="en-GB"/>
+              </w:rPr>
+              <w:t>AutoGrad</w:t>
+            </w:r>
+            <w:proofErr w:type="spellEnd"/>
+            <w:r>
+              <w:rPr>
+                <w:rFonts w:ascii="Calibri" w:eastAsia="Times New Roman" w:hAnsi="Calibri" w:cs="Calibri"/>
+                <w:color w:val="000000"/>
+                <w:lang w:val="en-GB" w:eastAsia="en-GB"/>
+              </w:rPr>
+              <w:t xml:space="preserve"> and </w:t>
+            </w:r>
+            <w:proofErr w:type="spellStart"/>
+            <w:r>
+              <w:rPr>
+                <w:rFonts w:ascii="Calibri" w:eastAsia="Times New Roman" w:hAnsi="Calibri" w:cs="Calibri"/>
+                <w:color w:val="000000"/>
+                <w:lang w:val="en-GB" w:eastAsia="en-GB"/>
+              </w:rPr>
+              <w:t>BackPropagation</w:t>
+            </w:r>
+            <w:proofErr w:type="spellEnd"/>
+            <w:r>
+              <w:rPr>
+                <w:rFonts w:ascii="Calibri" w:eastAsia="Times New Roman" w:hAnsi="Calibri" w:cs="Calibri"/>
+                <w:color w:val="000000"/>
+                <w:lang w:val="en-GB" w:eastAsia="en-GB"/>
+              </w:rPr>
+              <w:t xml:space="preserve"> in </w:t>
+            </w:r>
+            <w:proofErr w:type="spellStart"/>
+            <w:r>
+              <w:rPr>
+                <w:rFonts w:ascii="Calibri" w:eastAsia="Times New Roman" w:hAnsi="Calibri" w:cs="Calibri"/>
+                <w:color w:val="000000"/>
+                <w:lang w:val="en-GB" w:eastAsia="en-GB"/>
+              </w:rPr>
+              <w:t>PyTorch</w:t>
+            </w:r>
+            <w:proofErr w:type="spellEnd"/>
+            <w:r>
+              <w:rPr>
+                <w:rFonts w:ascii="Calibri" w:eastAsia="Times New Roman" w:hAnsi="Calibri" w:cs="Calibri"/>
+                <w:color w:val="000000"/>
+                <w:lang w:val="en-GB" w:eastAsia="en-GB"/>
+              </w:rPr>
+              <w:t>, GPU Acceleration</w:t>
             </w:r>
           </w:p>
         </w:tc>
@@ -1937,13 +2385,95 @@
                 <w:lang w:val="en-GB" w:eastAsia="en-GB"/>
               </w:rPr>
             </w:pPr>
-            <w:r>
-              <w:rPr>
-                <w:rFonts w:ascii="Calibri" w:eastAsia="Times New Roman" w:hAnsi="Calibri" w:cs="Calibri"/>
-                <w:color w:val="000000"/>
-                <w:lang w:val="en-GB" w:eastAsia="en-GB"/>
-              </w:rPr>
-              <w:t>DataSets and DataLoader objects, from Binary to MultiClass Classification, Softmax and CrossEntropy functions, Deep Neural Networks</w:t>
+            <w:proofErr w:type="spellStart"/>
+            <w:r>
+              <w:rPr>
+                <w:rFonts w:ascii="Calibri" w:eastAsia="Times New Roman" w:hAnsi="Calibri" w:cs="Calibri"/>
+                <w:color w:val="000000"/>
+                <w:lang w:val="en-GB" w:eastAsia="en-GB"/>
+              </w:rPr>
+              <w:t>DataSets</w:t>
+            </w:r>
+            <w:proofErr w:type="spellEnd"/>
+            <w:r>
+              <w:rPr>
+                <w:rFonts w:ascii="Calibri" w:eastAsia="Times New Roman" w:hAnsi="Calibri" w:cs="Calibri"/>
+                <w:color w:val="000000"/>
+                <w:lang w:val="en-GB" w:eastAsia="en-GB"/>
+              </w:rPr>
+              <w:t xml:space="preserve"> and </w:t>
+            </w:r>
+            <w:proofErr w:type="spellStart"/>
+            <w:r>
+              <w:rPr>
+                <w:rFonts w:ascii="Calibri" w:eastAsia="Times New Roman" w:hAnsi="Calibri" w:cs="Calibri"/>
+                <w:color w:val="000000"/>
+                <w:lang w:val="en-GB" w:eastAsia="en-GB"/>
+              </w:rPr>
+              <w:t>DataLoader</w:t>
+            </w:r>
+            <w:proofErr w:type="spellEnd"/>
+            <w:r>
+              <w:rPr>
+                <w:rFonts w:ascii="Calibri" w:eastAsia="Times New Roman" w:hAnsi="Calibri" w:cs="Calibri"/>
+                <w:color w:val="000000"/>
+                <w:lang w:val="en-GB" w:eastAsia="en-GB"/>
+              </w:rPr>
+              <w:t xml:space="preserve"> objects, from Binary to </w:t>
+            </w:r>
+            <w:proofErr w:type="spellStart"/>
+            <w:r>
+              <w:rPr>
+                <w:rFonts w:ascii="Calibri" w:eastAsia="Times New Roman" w:hAnsi="Calibri" w:cs="Calibri"/>
+                <w:color w:val="000000"/>
+                <w:lang w:val="en-GB" w:eastAsia="en-GB"/>
+              </w:rPr>
+              <w:t>MultiClass</w:t>
+            </w:r>
+            <w:proofErr w:type="spellEnd"/>
+            <w:r>
+              <w:rPr>
+                <w:rFonts w:ascii="Calibri" w:eastAsia="Times New Roman" w:hAnsi="Calibri" w:cs="Calibri"/>
+                <w:color w:val="000000"/>
+                <w:lang w:val="en-GB" w:eastAsia="en-GB"/>
+              </w:rPr>
+              <w:t xml:space="preserve"> Classification, </w:t>
+            </w:r>
+            <w:proofErr w:type="spellStart"/>
+            <w:r>
+              <w:rPr>
+                <w:rFonts w:ascii="Calibri" w:eastAsia="Times New Roman" w:hAnsi="Calibri" w:cs="Calibri"/>
+                <w:color w:val="000000"/>
+                <w:lang w:val="en-GB" w:eastAsia="en-GB"/>
+              </w:rPr>
+              <w:t>Softmax</w:t>
+            </w:r>
+            <w:proofErr w:type="spellEnd"/>
+            <w:r>
+              <w:rPr>
+                <w:rFonts w:ascii="Calibri" w:eastAsia="Times New Roman" w:hAnsi="Calibri" w:cs="Calibri"/>
+                <w:color w:val="000000"/>
+                <w:lang w:val="en-GB" w:eastAsia="en-GB"/>
+              </w:rPr>
+              <w:t xml:space="preserve"> and </w:t>
+            </w:r>
+            <w:proofErr w:type="spellStart"/>
+            <w:r>
+              <w:rPr>
+                <w:rFonts w:ascii="Calibri" w:eastAsia="Times New Roman" w:hAnsi="Calibri" w:cs="Calibri"/>
+                <w:color w:val="000000"/>
+                <w:lang w:val="en-GB" w:eastAsia="en-GB"/>
+              </w:rPr>
+              <w:t>CrossEntropy</w:t>
+            </w:r>
+            <w:proofErr w:type="spellEnd"/>
+            <w:r>
+              <w:rPr>
+                <w:rFonts w:ascii="Calibri" w:eastAsia="Times New Roman" w:hAnsi="Calibri" w:cs="Calibri"/>
+                <w:color w:val="000000"/>
+                <w:lang w:val="en-GB" w:eastAsia="en-GB"/>
+              </w:rPr>
+              <w:t xml:space="preserve"> functions, Deep Neural Networks</w:t>
             </w:r>
           </w:p>
         </w:tc>
@@ -2119,7 +2649,43 @@
                 <w:color w:val="000000"/>
                 <w:lang w:val="en-GB" w:eastAsia="en-GB"/>
               </w:rPr>
-              <w:t>Using the Conv2D layer to make CNNs, Dropout, BachNorm and LayerNorm, Pooling</w:t>
+              <w:t xml:space="preserve">Using the Conv2D layer to make CNNs, Dropout, </w:t>
+            </w:r>
+            <w:proofErr w:type="spellStart"/>
+            <w:r>
+              <w:rPr>
+                <w:rFonts w:ascii="Calibri" w:eastAsia="Times New Roman" w:hAnsi="Calibri" w:cs="Calibri"/>
+                <w:color w:val="000000"/>
+                <w:lang w:val="en-GB" w:eastAsia="en-GB"/>
+              </w:rPr>
+              <w:t>BachNorm</w:t>
+            </w:r>
+            <w:proofErr w:type="spellEnd"/>
+            <w:r>
+              <w:rPr>
+                <w:rFonts w:ascii="Calibri" w:eastAsia="Times New Roman" w:hAnsi="Calibri" w:cs="Calibri"/>
+                <w:color w:val="000000"/>
+                <w:lang w:val="en-GB" w:eastAsia="en-GB"/>
+              </w:rPr>
+              <w:t xml:space="preserve"> and </w:t>
+            </w:r>
+            <w:proofErr w:type="spellStart"/>
+            <w:r>
+              <w:rPr>
+                <w:rFonts w:ascii="Calibri" w:eastAsia="Times New Roman" w:hAnsi="Calibri" w:cs="Calibri"/>
+                <w:color w:val="000000"/>
+                <w:lang w:val="en-GB" w:eastAsia="en-GB"/>
+              </w:rPr>
+              <w:t>LayerNorm</w:t>
+            </w:r>
+            <w:proofErr w:type="spellEnd"/>
+            <w:r>
+              <w:rPr>
+                <w:rFonts w:ascii="Calibri" w:eastAsia="Times New Roman" w:hAnsi="Calibri" w:cs="Calibri"/>
+                <w:color w:val="000000"/>
+                <w:lang w:val="en-GB" w:eastAsia="en-GB"/>
+              </w:rPr>
+              <w:t>, Pooling</w:t>
             </w:r>
           </w:p>
         </w:tc>
@@ -2152,7 +2718,61 @@
                 <w:color w:val="000000"/>
                 <w:lang w:val="en-GB" w:eastAsia="en-GB"/>
               </w:rPr>
-              <w:t>Data Augmentation, Milestone models in CV (from AlexNet, ResNet, EfficientNet), Residual connections, Transfer Learning and Fine-Tuning</w:t>
+              <w:t xml:space="preserve">Data Augmentation, Milestone models in CV (from </w:t>
+            </w:r>
+            <w:proofErr w:type="spellStart"/>
+            <w:r>
+              <w:rPr>
+                <w:rFonts w:ascii="Calibri" w:eastAsia="Times New Roman" w:hAnsi="Calibri" w:cs="Calibri"/>
+                <w:color w:val="000000"/>
+                <w:lang w:val="en-GB" w:eastAsia="en-GB"/>
+              </w:rPr>
+              <w:t>AlexNet</w:t>
+            </w:r>
+            <w:proofErr w:type="spellEnd"/>
+            <w:r>
+              <w:rPr>
+                <w:rFonts w:ascii="Calibri" w:eastAsia="Times New Roman" w:hAnsi="Calibri" w:cs="Calibri"/>
+                <w:color w:val="000000"/>
+                <w:lang w:val="en-GB" w:eastAsia="en-GB"/>
+              </w:rPr>
+              <w:t xml:space="preserve">, </w:t>
+            </w:r>
+            <w:proofErr w:type="spellStart"/>
+            <w:r>
+              <w:rPr>
+                <w:rFonts w:ascii="Calibri" w:eastAsia="Times New Roman" w:hAnsi="Calibri" w:cs="Calibri"/>
+                <w:color w:val="000000"/>
+                <w:lang w:val="en-GB" w:eastAsia="en-GB"/>
+              </w:rPr>
+              <w:t>ResNet</w:t>
+            </w:r>
+            <w:proofErr w:type="spellEnd"/>
+            <w:r>
+              <w:rPr>
+                <w:rFonts w:ascii="Calibri" w:eastAsia="Times New Roman" w:hAnsi="Calibri" w:cs="Calibri"/>
+                <w:color w:val="000000"/>
+                <w:lang w:val="en-GB" w:eastAsia="en-GB"/>
+              </w:rPr>
+              <w:t xml:space="preserve">, </w:t>
+            </w:r>
+            <w:proofErr w:type="spellStart"/>
+            <w:r>
+              <w:rPr>
+                <w:rFonts w:ascii="Calibri" w:eastAsia="Times New Roman" w:hAnsi="Calibri" w:cs="Calibri"/>
+                <w:color w:val="000000"/>
+                <w:lang w:val="en-GB" w:eastAsia="en-GB"/>
+              </w:rPr>
+              <w:t>EfficientNet</w:t>
+            </w:r>
+            <w:proofErr w:type="spellEnd"/>
+            <w:r>
+              <w:rPr>
+                <w:rFonts w:ascii="Calibri" w:eastAsia="Times New Roman" w:hAnsi="Calibri" w:cs="Calibri"/>
+                <w:color w:val="000000"/>
+                <w:lang w:val="en-GB" w:eastAsia="en-GB"/>
+              </w:rPr>
+              <w:t>), Residual connections, Transfer Learning and Fine-Tuning</w:t>
             </w:r>
           </w:p>
         </w:tc>
@@ -2361,7 +2981,25 @@
                 <w:color w:val="000000"/>
                 <w:lang w:val="en-GB" w:eastAsia="en-GB"/>
               </w:rPr>
-              <w:t>Advanced Attacks methods and Defense methods for Neural Networks</w:t>
+              <w:t xml:space="preserve">Advanced Attacks methods and </w:t>
+            </w:r>
+            <w:proofErr w:type="spellStart"/>
+            <w:r>
+              <w:rPr>
+                <w:rFonts w:ascii="Calibri" w:eastAsia="Times New Roman" w:hAnsi="Calibri" w:cs="Calibri"/>
+                <w:color w:val="000000"/>
+                <w:lang w:val="en-GB" w:eastAsia="en-GB"/>
+              </w:rPr>
+              <w:t>Defense</w:t>
+            </w:r>
+            <w:proofErr w:type="spellEnd"/>
+            <w:r>
+              <w:rPr>
+                <w:rFonts w:ascii="Calibri" w:eastAsia="Times New Roman" w:hAnsi="Calibri" w:cs="Calibri"/>
+                <w:color w:val="000000"/>
+                <w:lang w:val="en-GB" w:eastAsia="en-GB"/>
+              </w:rPr>
+              <w:t xml:space="preserve"> methods for Neural Networks</w:t>
             </w:r>
           </w:p>
         </w:tc>
@@ -2891,8 +3529,18 @@
                 <w:color w:val="000000"/>
                 <w:lang w:val="en-GB" w:eastAsia="en-GB"/>
               </w:rPr>
-              <w:t>Introduction to the Embedding Problem, why it is so difficult to address it in the case of Language, a first attempt with CBoW</w:t>
-            </w:r>
+              <w:t xml:space="preserve">Introduction to the Embedding Problem, why it is so difficult to address it in the case of Language, a first attempt with </w:t>
+            </w:r>
+            <w:proofErr w:type="spellStart"/>
+            <w:r>
+              <w:rPr>
+                <w:rFonts w:ascii="Calibri" w:eastAsia="Times New Roman" w:hAnsi="Calibri" w:cs="Calibri"/>
+                <w:color w:val="000000"/>
+                <w:lang w:val="en-GB" w:eastAsia="en-GB"/>
+              </w:rPr>
+              <w:t>CBoW</w:t>
+            </w:r>
+            <w:proofErr w:type="spellEnd"/>
           </w:p>
         </w:tc>
         <w:tc>
@@ -2924,7 +3572,61 @@
                 <w:color w:val="000000"/>
                 <w:lang w:val="en-GB" w:eastAsia="en-GB"/>
               </w:rPr>
-              <w:t>From CBoW to SkipGram, FastText and ELMO, lesson learned along the way</w:t>
+              <w:t xml:space="preserve">From </w:t>
+            </w:r>
+            <w:proofErr w:type="spellStart"/>
+            <w:r>
+              <w:rPr>
+                <w:rFonts w:ascii="Calibri" w:eastAsia="Times New Roman" w:hAnsi="Calibri" w:cs="Calibri"/>
+                <w:color w:val="000000"/>
+                <w:lang w:val="en-GB" w:eastAsia="en-GB"/>
+              </w:rPr>
+              <w:t>CBoW</w:t>
+            </w:r>
+            <w:proofErr w:type="spellEnd"/>
+            <w:r>
+              <w:rPr>
+                <w:rFonts w:ascii="Calibri" w:eastAsia="Times New Roman" w:hAnsi="Calibri" w:cs="Calibri"/>
+                <w:color w:val="000000"/>
+                <w:lang w:val="en-GB" w:eastAsia="en-GB"/>
+              </w:rPr>
+              <w:t xml:space="preserve"> to </w:t>
+            </w:r>
+            <w:proofErr w:type="spellStart"/>
+            <w:r>
+              <w:rPr>
+                <w:rFonts w:ascii="Calibri" w:eastAsia="Times New Roman" w:hAnsi="Calibri" w:cs="Calibri"/>
+                <w:color w:val="000000"/>
+                <w:lang w:val="en-GB" w:eastAsia="en-GB"/>
+              </w:rPr>
+              <w:t>SkipGram</w:t>
+            </w:r>
+            <w:proofErr w:type="spellEnd"/>
+            <w:r>
+              <w:rPr>
+                <w:rFonts w:ascii="Calibri" w:eastAsia="Times New Roman" w:hAnsi="Calibri" w:cs="Calibri"/>
+                <w:color w:val="000000"/>
+                <w:lang w:val="en-GB" w:eastAsia="en-GB"/>
+              </w:rPr>
+              <w:t xml:space="preserve">, </w:t>
+            </w:r>
+            <w:proofErr w:type="spellStart"/>
+            <w:r>
+              <w:rPr>
+                <w:rFonts w:ascii="Calibri" w:eastAsia="Times New Roman" w:hAnsi="Calibri" w:cs="Calibri"/>
+                <w:color w:val="000000"/>
+                <w:lang w:val="en-GB" w:eastAsia="en-GB"/>
+              </w:rPr>
+              <w:t>FastText</w:t>
+            </w:r>
+            <w:proofErr w:type="spellEnd"/>
+            <w:r>
+              <w:rPr>
+                <w:rFonts w:ascii="Calibri" w:eastAsia="Times New Roman" w:hAnsi="Calibri" w:cs="Calibri"/>
+                <w:color w:val="000000"/>
+                <w:lang w:val="en-GB" w:eastAsia="en-GB"/>
+              </w:rPr>
+              <w:t xml:space="preserve"> and ELMO, lesson learned along the way</w:t>
             </w:r>
           </w:p>
         </w:tc>
@@ -2957,7 +3659,25 @@
                 <w:color w:val="000000"/>
                 <w:lang w:val="en-GB" w:eastAsia="en-GB"/>
               </w:rPr>
-              <w:t>The need for attention and Transformers, contemporary uses of transformers,  evaluating an embedding</w:t>
+              <w:t xml:space="preserve">The need for attention and Transformers, contemporary uses of </w:t>
+            </w:r>
+            <w:proofErr w:type="gramStart"/>
+            <w:r>
+              <w:rPr>
+                <w:rFonts w:ascii="Calibri" w:eastAsia="Times New Roman" w:hAnsi="Calibri" w:cs="Calibri"/>
+                <w:color w:val="000000"/>
+                <w:lang w:val="en-GB" w:eastAsia="en-GB"/>
+              </w:rPr>
+              <w:t>transformers,  evaluating</w:t>
+            </w:r>
+            <w:proofErr w:type="gramEnd"/>
+            <w:r>
+              <w:rPr>
+                <w:rFonts w:ascii="Calibri" w:eastAsia="Times New Roman" w:hAnsi="Calibri" w:cs="Calibri"/>
+                <w:color w:val="000000"/>
+                <w:lang w:val="en-GB" w:eastAsia="en-GB"/>
+              </w:rPr>
+              <w:t xml:space="preserve"> an embedding</w:t>
             </w:r>
           </w:p>
         </w:tc>
@@ -3206,7 +3926,25 @@
                 <w:color w:val="000000"/>
                 <w:lang w:val="en-GB" w:eastAsia="en-GB"/>
               </w:rPr>
-              <w:t>Advanced uses for Graph Convolutional models, GraphSAGE and attention in Graph Models</w:t>
+              <w:t xml:space="preserve">Advanced uses for Graph Convolutional models, </w:t>
+            </w:r>
+            <w:proofErr w:type="spellStart"/>
+            <w:r>
+              <w:rPr>
+                <w:rFonts w:ascii="Calibri" w:eastAsia="Times New Roman" w:hAnsi="Calibri" w:cs="Calibri"/>
+                <w:color w:val="000000"/>
+                <w:lang w:val="en-GB" w:eastAsia="en-GB"/>
+              </w:rPr>
+              <w:t>GraphSAGE</w:t>
+            </w:r>
+            <w:proofErr w:type="spellEnd"/>
+            <w:r>
+              <w:rPr>
+                <w:rFonts w:ascii="Calibri" w:eastAsia="Times New Roman" w:hAnsi="Calibri" w:cs="Calibri"/>
+                <w:color w:val="000000"/>
+                <w:lang w:val="en-GB" w:eastAsia="en-GB"/>
+              </w:rPr>
+              <w:t xml:space="preserve"> and attention in Graph Models</w:t>
             </w:r>
           </w:p>
         </w:tc>
@@ -3381,7 +4119,25 @@
                 <w:color w:val="000000"/>
                 <w:lang w:val="en-GB" w:eastAsia="en-GB"/>
               </w:rPr>
-              <w:t>Introduction to AutoEncoders and Generative AI problems</w:t>
+              <w:t xml:space="preserve">Introduction to </w:t>
+            </w:r>
+            <w:proofErr w:type="spellStart"/>
+            <w:r>
+              <w:rPr>
+                <w:rFonts w:ascii="Calibri" w:eastAsia="Times New Roman" w:hAnsi="Calibri" w:cs="Calibri"/>
+                <w:color w:val="000000"/>
+                <w:lang w:val="en-GB" w:eastAsia="en-GB"/>
+              </w:rPr>
+              <w:t>AutoEncoders</w:t>
+            </w:r>
+            <w:proofErr w:type="spellEnd"/>
+            <w:r>
+              <w:rPr>
+                <w:rFonts w:ascii="Calibri" w:eastAsia="Times New Roman" w:hAnsi="Calibri" w:cs="Calibri"/>
+                <w:color w:val="000000"/>
+                <w:lang w:val="en-GB" w:eastAsia="en-GB"/>
+              </w:rPr>
+              <w:t xml:space="preserve"> and Generative AI problems</w:t>
             </w:r>
           </w:p>
         </w:tc>
@@ -3414,7 +4170,43 @@
                 <w:color w:val="000000"/>
                 <w:lang w:val="en-GB" w:eastAsia="en-GB"/>
               </w:rPr>
-              <w:t>From AutoEncoders to Variational AutoEncoders and Generative Adversarial Networks</w:t>
+              <w:t xml:space="preserve">From </w:t>
+            </w:r>
+            <w:proofErr w:type="spellStart"/>
+            <w:r>
+              <w:rPr>
+                <w:rFonts w:ascii="Calibri" w:eastAsia="Times New Roman" w:hAnsi="Calibri" w:cs="Calibri"/>
+                <w:color w:val="000000"/>
+                <w:lang w:val="en-GB" w:eastAsia="en-GB"/>
+              </w:rPr>
+              <w:t>AutoEncoders</w:t>
+            </w:r>
+            <w:proofErr w:type="spellEnd"/>
+            <w:r>
+              <w:rPr>
+                <w:rFonts w:ascii="Calibri" w:eastAsia="Times New Roman" w:hAnsi="Calibri" w:cs="Calibri"/>
+                <w:color w:val="000000"/>
+                <w:lang w:val="en-GB" w:eastAsia="en-GB"/>
+              </w:rPr>
+              <w:t xml:space="preserve"> to Variational </w:t>
+            </w:r>
+            <w:proofErr w:type="spellStart"/>
+            <w:r>
+              <w:rPr>
+                <w:rFonts w:ascii="Calibri" w:eastAsia="Times New Roman" w:hAnsi="Calibri" w:cs="Calibri"/>
+                <w:color w:val="000000"/>
+                <w:lang w:val="en-GB" w:eastAsia="en-GB"/>
+              </w:rPr>
+              <w:t>AutoEncoders</w:t>
+            </w:r>
+            <w:proofErr w:type="spellEnd"/>
+            <w:r>
+              <w:rPr>
+                <w:rFonts w:ascii="Calibri" w:eastAsia="Times New Roman" w:hAnsi="Calibri" w:cs="Calibri"/>
+                <w:color w:val="000000"/>
+                <w:lang w:val="en-GB" w:eastAsia="en-GB"/>
+              </w:rPr>
+              <w:t xml:space="preserve"> and Generative Adversarial Networks</w:t>
             </w:r>
           </w:p>
         </w:tc>
@@ -3479,8 +4271,18 @@
                 <w:color w:val="000000"/>
                 <w:lang w:val="en-GB" w:eastAsia="en-GB"/>
               </w:rPr>
-              <w:t>: Wasserstein GANs, Progressive GANs, Conditional GANs, Style GANs and CycleGANs</w:t>
-            </w:r>
+              <w:t xml:space="preserve">: Wasserstein GANs, Progressive GANs, Conditional GANs, Style GANs and </w:t>
+            </w:r>
+            <w:proofErr w:type="spellStart"/>
+            <w:r>
+              <w:rPr>
+                <w:rFonts w:ascii="Calibri" w:eastAsia="Times New Roman" w:hAnsi="Calibri" w:cs="Calibri"/>
+                <w:color w:val="000000"/>
+                <w:lang w:val="en-GB" w:eastAsia="en-GB"/>
+              </w:rPr>
+              <w:t>CycleGANs</w:t>
+            </w:r>
+            <w:proofErr w:type="spellEnd"/>
           </w:p>
         </w:tc>
         <w:tc>
@@ -3823,7 +4625,29 @@
                 <w:color w:val="000000"/>
                 <w:lang w:val="en-GB" w:eastAsia="en-GB"/>
               </w:rPr>
-              <w:t>A pot-pourri of curiosity topics in Deep Learning</w:t>
+              <w:t>A pot-</w:t>
+            </w:r>
+            <w:proofErr w:type="spellStart"/>
+            <w:r>
+              <w:rPr>
+                <w:rFonts w:ascii="Calibri" w:eastAsia="Times New Roman" w:hAnsi="Calibri" w:cs="Calibri"/>
+                <w:b/>
+                <w:bCs/>
+                <w:color w:val="000000"/>
+                <w:lang w:val="en-GB" w:eastAsia="en-GB"/>
+              </w:rPr>
+              <w:t>pourri</w:t>
+            </w:r>
+            <w:proofErr w:type="spellEnd"/>
+            <w:r>
+              <w:rPr>
+                <w:rFonts w:ascii="Calibri" w:eastAsia="Times New Roman" w:hAnsi="Calibri" w:cs="Calibri"/>
+                <w:b/>
+                <w:bCs/>
+                <w:color w:val="000000"/>
+                <w:lang w:val="en-GB" w:eastAsia="en-GB"/>
+              </w:rPr>
+              <w:t xml:space="preserve"> of curiosity topics in Deep Learning</w:t>
             </w:r>
           </w:p>
         </w:tc>
@@ -3969,7 +4793,25 @@
                 <w:color w:val="000000"/>
                 <w:lang w:val="en-GB" w:eastAsia="en-GB"/>
               </w:rPr>
-              <w:t>On the need of Explainable AI, and attempts to make AI models explainable.</w:t>
+              <w:t xml:space="preserve">On the need of Explainable </w:t>
+            </w:r>
+            <w:proofErr w:type="gramStart"/>
+            <w:r>
+              <w:rPr>
+                <w:rFonts w:ascii="Calibri" w:eastAsia="Times New Roman" w:hAnsi="Calibri" w:cs="Calibri"/>
+                <w:color w:val="000000"/>
+                <w:lang w:val="en-GB" w:eastAsia="en-GB"/>
+              </w:rPr>
+              <w:t>AI, and</w:t>
+            </w:r>
+            <w:proofErr w:type="gramEnd"/>
+            <w:r>
+              <w:rPr>
+                <w:rFonts w:ascii="Calibri" w:eastAsia="Times New Roman" w:hAnsi="Calibri" w:cs="Calibri"/>
+                <w:color w:val="000000"/>
+                <w:lang w:val="en-GB" w:eastAsia="en-GB"/>
+              </w:rPr>
+              <w:t xml:space="preserve"> attempts to make AI models explainable.</w:t>
             </w:r>
           </w:p>
         </w:tc>
@@ -4211,7 +5053,43 @@
                 <w:color w:val="000000"/>
                 <w:lang w:val="en-GB" w:eastAsia="en-GB"/>
               </w:rPr>
-              <w:t>Avengers, Assemble: understanding ChatGPT  and how it was made.</w:t>
+              <w:t xml:space="preserve">Avengers, </w:t>
+            </w:r>
+            <w:proofErr w:type="gramStart"/>
+            <w:r>
+              <w:rPr>
+                <w:rFonts w:ascii="Calibri" w:eastAsia="Times New Roman" w:hAnsi="Calibri" w:cs="Calibri"/>
+                <w:color w:val="000000"/>
+                <w:lang w:val="en-GB" w:eastAsia="en-GB"/>
+              </w:rPr>
+              <w:t>Assemble</w:t>
+            </w:r>
+            <w:proofErr w:type="gramEnd"/>
+            <w:r>
+              <w:rPr>
+                <w:rFonts w:ascii="Calibri" w:eastAsia="Times New Roman" w:hAnsi="Calibri" w:cs="Calibri"/>
+                <w:color w:val="000000"/>
+                <w:lang w:val="en-GB" w:eastAsia="en-GB"/>
+              </w:rPr>
+              <w:t xml:space="preserve">: understanding </w:t>
+            </w:r>
+            <w:proofErr w:type="gramStart"/>
+            <w:r>
+              <w:rPr>
+                <w:rFonts w:ascii="Calibri" w:eastAsia="Times New Roman" w:hAnsi="Calibri" w:cs="Calibri"/>
+                <w:color w:val="000000"/>
+                <w:lang w:val="en-GB" w:eastAsia="en-GB"/>
+              </w:rPr>
+              <w:t>ChatGPT  and</w:t>
+            </w:r>
+            <w:proofErr w:type="gramEnd"/>
+            <w:r>
+              <w:rPr>
+                <w:rFonts w:ascii="Calibri" w:eastAsia="Times New Roman" w:hAnsi="Calibri" w:cs="Calibri"/>
+                <w:color w:val="000000"/>
+                <w:lang w:val="en-GB" w:eastAsia="en-GB"/>
+              </w:rPr>
+              <w:t xml:space="preserve"> how it was made.</w:t>
             </w:r>
             <w:r>
               <w:rPr>
@@ -4520,7 +5398,6 @@
           <w:lang w:val="en-GB"/>
         </w:rPr>
       </w:pPr>
-      <w:commentRangeStart w:id="0"/>
       <w:r>
         <w:rPr>
           <w:lang w:val="en-GB"/>
@@ -4531,7 +5408,21 @@
         <w:rPr>
           <w:lang w:val="en-GB"/>
         </w:rPr>
-        <w:t xml:space="preserve"> where an industry conferencer will discuss the </w:t>
+        <w:t xml:space="preserve"> where an industry </w:t>
+      </w:r>
+      <w:proofErr w:type="spellStart"/>
+      <w:r>
+        <w:rPr>
+          <w:lang w:val="en-GB"/>
+        </w:rPr>
+        <w:t>conferencer</w:t>
+      </w:r>
+      <w:proofErr w:type="spellEnd"/>
+      <w:r>
+        <w:rPr>
+          <w:lang w:val="en-GB"/>
+        </w:rPr>
+        <w:t xml:space="preserve"> will discuss the </w:t>
       </w:r>
       <w:r>
         <w:rPr>
@@ -4587,29 +5478,47 @@
         <w:rPr>
           <w:lang w:val="en-GB"/>
         </w:rPr>
-        <w:t xml:space="preserve"> April, 2-3.30pm, and it</w:t>
-      </w:r>
-      <w:r>
-        <w:rPr>
-          <w:lang w:val="en-GB"/>
-        </w:rPr>
         <w:t xml:space="preserve"> </w:t>
       </w:r>
-      <w:r>
-        <w:rPr>
-          <w:lang w:val="en-GB"/>
-        </w:rPr>
-        <w:t>will be confirmed at a later date.</w:t>
-      </w:r>
-      <w:commentRangeEnd w:id="0"/>
-      <w:r>
-        <w:rPr>
-          <w:rStyle w:val="CommentReference"/>
-          <w:sz w:val="22"/>
-          <w:szCs w:val="22"/>
-          <w:lang w:val="en-GB"/>
-        </w:rPr>
-        <w:commentReference w:id="0"/>
+      <w:proofErr w:type="gramStart"/>
+      <w:r>
+        <w:rPr>
+          <w:lang w:val="en-GB"/>
+        </w:rPr>
+        <w:t>April,</w:t>
+      </w:r>
+      <w:proofErr w:type="gramEnd"/>
+      <w:r>
+        <w:rPr>
+          <w:lang w:val="en-GB"/>
+        </w:rPr>
+        <w:t xml:space="preserve"> 2-3.30pm, and it</w:t>
+      </w:r>
+      <w:r>
+        <w:rPr>
+          <w:lang w:val="en-GB"/>
+        </w:rPr>
+        <w:t xml:space="preserve"> </w:t>
+      </w:r>
+      <w:r>
+        <w:rPr>
+          <w:lang w:val="en-GB"/>
+        </w:rPr>
+        <w:t xml:space="preserve">will be confirmed </w:t>
+      </w:r>
+      <w:proofErr w:type="gramStart"/>
+      <w:r>
+        <w:rPr>
+          <w:lang w:val="en-GB"/>
+        </w:rPr>
+        <w:t>at a later date</w:t>
+      </w:r>
+      <w:proofErr w:type="gramEnd"/>
+      <w:r>
+        <w:rPr>
+          <w:lang w:val="en-GB"/>
+        </w:rPr>
+        <w:t>.</w:t>
       </w:r>
     </w:p>
     <w:p>
@@ -4702,11 +5611,19 @@
           <w:lang w:val="en-GB"/>
         </w:rPr>
       </w:pPr>
-      <w:r>
-        <w:rPr>
-          <w:lang w:val="en-GB"/>
-        </w:rPr>
-        <w:t>At the moment, the current timetable is set as follows.</w:t>
+      <w:proofErr w:type="gramStart"/>
+      <w:r>
+        <w:rPr>
+          <w:lang w:val="en-GB"/>
+        </w:rPr>
+        <w:t>At the moment</w:t>
+      </w:r>
+      <w:proofErr w:type="gramEnd"/>
+      <w:r>
+        <w:rPr>
+          <w:lang w:val="en-GB"/>
+        </w:rPr>
+        <w:t>, the current timetable is set as follows.</w:t>
       </w:r>
     </w:p>
     <w:p>
@@ -4992,7 +5909,21 @@
         <w:rPr>
           <w:lang w:val="en-GB"/>
         </w:rPr>
-        <w:t xml:space="preserve">The following lectures will be cancelled and will be replaced by video recordings to be uploaded on eDimension. </w:t>
+        <w:t xml:space="preserve">The following lectures will be cancelled and will be replaced by video recordings to be uploaded on </w:t>
+      </w:r>
+      <w:proofErr w:type="spellStart"/>
+      <w:r>
+        <w:rPr>
+          <w:lang w:val="en-GB"/>
+        </w:rPr>
+        <w:t>eDimension</w:t>
+      </w:r>
+      <w:proofErr w:type="spellEnd"/>
+      <w:r>
+        <w:rPr>
+          <w:lang w:val="en-GB"/>
+        </w:rPr>
+        <w:t xml:space="preserve">. </w:t>
       </w:r>
       <w:r>
         <w:rPr>
@@ -5018,7 +5949,21 @@
         <w:rPr>
           <w:lang w:val="en-GB"/>
         </w:rPr>
-        <w:t xml:space="preserve">CNY, 10-11 February, lectures W4S2 will be replaced with online recordings on eDimension. Do note that classes W4S1 on Mondays are currently reported by OSA as </w:t>
+        <w:t xml:space="preserve">CNY, 10-11 February, lectures W4S2 will be replaced with online recordings on </w:t>
+      </w:r>
+      <w:proofErr w:type="spellStart"/>
+      <w:r>
+        <w:rPr>
+          <w:lang w:val="en-GB"/>
+        </w:rPr>
+        <w:t>eDimension</w:t>
+      </w:r>
+      <w:proofErr w:type="spellEnd"/>
+      <w:r>
+        <w:rPr>
+          <w:lang w:val="en-GB"/>
+        </w:rPr>
+        <w:t xml:space="preserve">. Do note that classes W4S1 on Mondays are currently reported by OSA as </w:t>
       </w:r>
       <w:r>
         <w:rPr>
@@ -5152,7 +6097,7 @@
         </w:rPr>
         <w:t>Michael A. Nielsen, “Neural networks and deep learning”, 2015. (</w:t>
       </w:r>
-      <w:hyperlink r:id="rId17" w:history="1">
+      <w:hyperlink r:id="rId13" w:history="1">
         <w:r>
           <w:rPr>
             <w:rStyle w:val="Hyperlink"/>
@@ -5185,7 +6130,7 @@
         </w:rPr>
         <w:t>Ian Goodfellow and Yoshua Bengio and Aaron Courville, “Deep learning”, 2016. (</w:t>
       </w:r>
-      <w:hyperlink r:id="rId18" w:history="1">
+      <w:hyperlink r:id="rId14" w:history="1">
         <w:r>
           <w:rPr>
             <w:rStyle w:val="Hyperlink"/>
@@ -5224,7 +6169,7 @@
         </w:rPr>
         <w:t>Yaser S. Abu-Mostafa and Malik Magdon-Ismail and Hsuan-Tien Lin. “Learning from data”, 2012. (</w:t>
       </w:r>
-      <w:hyperlink r:id="rId19" w:history="1">
+      <w:hyperlink r:id="rId15" w:history="1">
         <w:r>
           <w:rPr>
             <w:rStyle w:val="Hyperlink"/>
@@ -5281,7 +6226,7 @@
         </w:rPr>
         <w:t xml:space="preserve"> (</w:t>
       </w:r>
-      <w:hyperlink r:id="rId20" w:history="1">
+      <w:hyperlink r:id="rId16" w:history="1">
         <w:r>
           <w:rPr>
             <w:rStyle w:val="Hyperlink"/>
@@ -5325,13 +6270,41 @@
         <w:rPr>
           <w:lang w:val="en-GB"/>
         </w:rPr>
-        <w:t>recent concepts and scientific papers in Artificial Intelligence/Machine Learning/Neural Networks. Arxiv links to the paper PDFs will often be provided, and demo codes might be shown in class.</w:t>
-      </w:r>
-      <w:r>
-        <w:rPr>
-          <w:lang w:val="en-GB"/>
-        </w:rPr>
-        <w:t xml:space="preserve"> Students are also encouraged to refer to the PapersWithCode website.</w:t>
+        <w:t xml:space="preserve">recent concepts and scientific papers in Artificial Intelligence/Machine Learning/Neural Networks. </w:t>
+      </w:r>
+      <w:proofErr w:type="spellStart"/>
+      <w:r>
+        <w:rPr>
+          <w:lang w:val="en-GB"/>
+        </w:rPr>
+        <w:t>Arxiv</w:t>
+      </w:r>
+      <w:proofErr w:type="spellEnd"/>
+      <w:r>
+        <w:rPr>
+          <w:lang w:val="en-GB"/>
+        </w:rPr>
+        <w:t xml:space="preserve"> links to the paper PDFs will often be provided, and demo codes might be shown in class.</w:t>
+      </w:r>
+      <w:r>
+        <w:rPr>
+          <w:lang w:val="en-GB"/>
+        </w:rPr>
+        <w:t xml:space="preserve"> Students are also encouraged to refer to the </w:t>
+      </w:r>
+      <w:proofErr w:type="spellStart"/>
+      <w:r>
+        <w:rPr>
+          <w:lang w:val="en-GB"/>
+        </w:rPr>
+        <w:t>PapersWithCode</w:t>
+      </w:r>
+      <w:proofErr w:type="spellEnd"/>
+      <w:r>
+        <w:rPr>
+          <w:lang w:val="en-GB"/>
+        </w:rPr>
+        <w:t xml:space="preserve"> website.</w:t>
       </w:r>
     </w:p>
     <w:p>
@@ -5423,6 +6396,7 @@
           <w:lang w:val="en-GB"/>
         </w:rPr>
       </w:pPr>
+      <w:proofErr w:type="spellStart"/>
       <w:r>
         <w:rPr>
           <w:b/>
@@ -5430,7 +6404,17 @@
           <w:u w:val="single"/>
           <w:lang w:val="en-GB"/>
         </w:rPr>
-        <w:t>Homeworks (</w:t>
+        <w:t>Homeworks</w:t>
+      </w:r>
+      <w:proofErr w:type="spellEnd"/>
+      <w:r>
+        <w:rPr>
+          <w:b/>
+          <w:color w:val="44546A" w:themeColor="text2"/>
+          <w:u w:val="single"/>
+          <w:lang w:val="en-GB"/>
+        </w:rPr>
+        <w:t xml:space="preserve"> (</w:t>
       </w:r>
       <w:r>
         <w:rPr>
@@ -5462,6 +6446,7 @@
           <w:lang w:val="en-GB"/>
         </w:rPr>
       </w:pPr>
+      <w:proofErr w:type="spellStart"/>
       <w:r>
         <w:rPr>
           <w:lang w:val="en-GB"/>
@@ -5474,6 +6459,7 @@
         </w:rPr>
         <w:t>omeworks</w:t>
       </w:r>
+      <w:proofErr w:type="spellEnd"/>
       <w:r>
         <w:rPr>
           <w:lang w:val="en-GB"/>
@@ -5526,7 +6512,21 @@
         <w:rPr>
           <w:lang w:val="en-GB"/>
         </w:rPr>
-        <w:t xml:space="preserve"> posted on eDimension.</w:t>
+        <w:t xml:space="preserve"> posted on </w:t>
+      </w:r>
+      <w:proofErr w:type="spellStart"/>
+      <w:r>
+        <w:rPr>
+          <w:lang w:val="en-GB"/>
+        </w:rPr>
+        <w:t>eDimension</w:t>
+      </w:r>
+      <w:proofErr w:type="spellEnd"/>
+      <w:r>
+        <w:rPr>
+          <w:lang w:val="en-GB"/>
+        </w:rPr>
+        <w:t>.</w:t>
       </w:r>
     </w:p>
     <w:p>
@@ -5546,13 +6546,41 @@
         </w:rPr>
         <w:t xml:space="preserve">One extension request per term is allowed, </w:t>
       </w:r>
+      <w:proofErr w:type="gramStart"/>
       <w:r>
         <w:rPr>
           <w:b/>
           <w:bCs/>
           <w:lang w:val="en-GB"/>
         </w:rPr>
-        <w:t xml:space="preserve">as long as you email </w:t>
+        <w:t>as long as</w:t>
+      </w:r>
+      <w:proofErr w:type="gramEnd"/>
+      <w:r>
+        <w:rPr>
+          <w:b/>
+          <w:bCs/>
+          <w:lang w:val="en-GB"/>
+        </w:rPr>
+        <w:t xml:space="preserve"> </w:t>
+      </w:r>
+      <w:proofErr w:type="spellStart"/>
+      <w:r>
+        <w:rPr>
+          <w:b/>
+          <w:bCs/>
+          <w:lang w:val="en-GB"/>
+        </w:rPr>
+        <w:t>you</w:t>
+      </w:r>
+      <w:proofErr w:type="spellEnd"/>
+      <w:r>
+        <w:rPr>
+          <w:b/>
+          <w:bCs/>
+          <w:lang w:val="en-GB"/>
+        </w:rPr>
+        <w:t xml:space="preserve"> email </w:t>
       </w:r>
       <w:r>
         <w:rPr>
@@ -5617,7 +6645,23 @@
           <w:bCs/>
           <w:lang w:val="en-GB"/>
         </w:rPr>
-        <w:t>apply</w:t>
+        <w:t xml:space="preserve">be </w:t>
+      </w:r>
+      <w:r>
+        <w:rPr>
+          <w:b/>
+          <w:bCs/>
+          <w:lang w:val="en-GB"/>
+        </w:rPr>
+        <w:t>appl</w:t>
+      </w:r>
+      <w:r>
+        <w:rPr>
+          <w:b/>
+          <w:bCs/>
+          <w:lang w:val="en-GB"/>
+        </w:rPr>
+        <w:t>ied</w:t>
       </w:r>
       <w:r>
         <w:rPr>
@@ -5761,11 +6805,19 @@
           <w:lang w:val="en-GB"/>
         </w:rPr>
       </w:pPr>
-      <w:r>
-        <w:rPr>
-          <w:lang w:val="en-GB"/>
-        </w:rPr>
-        <w:t xml:space="preserve">Paper exam, </w:t>
+      <w:proofErr w:type="gramStart"/>
+      <w:r>
+        <w:rPr>
+          <w:lang w:val="en-GB"/>
+        </w:rPr>
+        <w:t>Paper exam,</w:t>
+      </w:r>
+      <w:proofErr w:type="gramEnd"/>
+      <w:r>
+        <w:rPr>
+          <w:lang w:val="en-GB"/>
+        </w:rPr>
+        <w:t xml:space="preserve"> </w:t>
       </w:r>
       <w:r>
         <w:rPr>
@@ -5843,7 +6895,21 @@
         <w:rPr>
           <w:lang w:val="en-GB"/>
         </w:rPr>
-        <w:t>!) cheatsheet is allowed for exams.</w:t>
+        <w:t xml:space="preserve">!) </w:t>
+      </w:r>
+      <w:proofErr w:type="spellStart"/>
+      <w:r>
+        <w:rPr>
+          <w:lang w:val="en-GB"/>
+        </w:rPr>
+        <w:t>cheatsheet</w:t>
+      </w:r>
+      <w:proofErr w:type="spellEnd"/>
+      <w:r>
+        <w:rPr>
+          <w:lang w:val="en-GB"/>
+        </w:rPr>
+        <w:t xml:space="preserve"> is allowed for exams.</w:t>
       </w:r>
       <w:r>
         <w:rPr>
@@ -6021,11 +7087,19 @@
           <w:lang w:val="en-GB"/>
         </w:rPr>
       </w:pPr>
-      <w:r>
-        <w:rPr>
-          <w:lang w:val="en-GB"/>
-        </w:rPr>
-        <w:t xml:space="preserve">Paper exam, might require light coding on paper. </w:t>
+      <w:proofErr w:type="gramStart"/>
+      <w:r>
+        <w:rPr>
+          <w:lang w:val="en-GB"/>
+        </w:rPr>
+        <w:t>Paper exam,</w:t>
+      </w:r>
+      <w:proofErr w:type="gramEnd"/>
+      <w:r>
+        <w:rPr>
+          <w:lang w:val="en-GB"/>
+        </w:rPr>
+        <w:t xml:space="preserve"> might require light coding on paper. </w:t>
       </w:r>
       <w:r>
         <w:rPr>
@@ -6091,7 +7165,21 @@
         <w:rPr>
           <w:lang w:val="en-GB"/>
         </w:rPr>
-        <w:t>!) cheatsheet is allowed for exams.</w:t>
+        <w:t xml:space="preserve">!) </w:t>
+      </w:r>
+      <w:proofErr w:type="spellStart"/>
+      <w:r>
+        <w:rPr>
+          <w:lang w:val="en-GB"/>
+        </w:rPr>
+        <w:t>cheatsheet</w:t>
+      </w:r>
+      <w:proofErr w:type="spellEnd"/>
+      <w:r>
+        <w:rPr>
+          <w:lang w:val="en-GB"/>
+        </w:rPr>
+        <w:t xml:space="preserve"> is allowed for exams.</w:t>
       </w:r>
       <w:r>
         <w:rPr>
@@ -6182,8 +7270,16 @@
         <w:rPr>
           <w:lang w:val="en-GB"/>
         </w:rPr>
-        <w:t xml:space="preserve"> on eDimension</w:t>
-      </w:r>
+        <w:t xml:space="preserve"> on </w:t>
+      </w:r>
+      <w:proofErr w:type="spellStart"/>
+      <w:r>
+        <w:rPr>
+          <w:lang w:val="en-GB"/>
+        </w:rPr>
+        <w:t>eDimension</w:t>
+      </w:r>
+      <w:proofErr w:type="spellEnd"/>
       <w:r>
         <w:rPr>
           <w:lang w:val="en-GB"/>
@@ -6472,19 +7568,43 @@
           <w:lang w:val="en-GB"/>
         </w:rPr>
       </w:pPr>
+      <w:proofErr w:type="gramStart"/>
       <w:r>
         <w:rPr>
           <w:b/>
           <w:bCs/>
           <w:lang w:val="en-GB"/>
         </w:rPr>
-        <w:t>Also a note for audit students:</w:t>
-      </w:r>
-      <w:r>
-        <w:rPr>
-          <w:lang w:val="en-GB"/>
-        </w:rPr>
-        <w:t xml:space="preserve"> A successful audit will require attending classes and submitting at least half of the homeworks. </w:t>
+        <w:t>Also</w:t>
+      </w:r>
+      <w:proofErr w:type="gramEnd"/>
+      <w:r>
+        <w:rPr>
+          <w:b/>
+          <w:bCs/>
+          <w:lang w:val="en-GB"/>
+        </w:rPr>
+        <w:t xml:space="preserve"> a note for audit students:</w:t>
+      </w:r>
+      <w:r>
+        <w:rPr>
+          <w:lang w:val="en-GB"/>
+        </w:rPr>
+        <w:t xml:space="preserve"> A successful audit will require attending classes and submitting at least half of the </w:t>
+      </w:r>
+      <w:proofErr w:type="spellStart"/>
+      <w:r>
+        <w:rPr>
+          <w:lang w:val="en-GB"/>
+        </w:rPr>
+        <w:t>homeworks</w:t>
+      </w:r>
+      <w:proofErr w:type="spellEnd"/>
+      <w:r>
+        <w:rPr>
+          <w:lang w:val="en-GB"/>
+        </w:rPr>
+        <w:t xml:space="preserve">. </w:t>
       </w:r>
       <w:r>
         <w:rPr>
@@ -6493,13 +7613,279 @@
         <w:t>Projects and exams are not required, but we leave it to the students to decide if they want to participate in those or not.</w:t>
       </w:r>
     </w:p>
+    <w:p>
+      <w:pPr>
+        <w:pStyle w:val="Heading1"/>
+        <w:rPr>
+          <w:lang w:val="en-GB"/>
+        </w:rPr>
+      </w:pPr>
+      <w:r>
+        <w:rPr>
+          <w:lang w:val="en-GB"/>
+        </w:rPr>
+        <w:lastRenderedPageBreak/>
+        <w:t>On the use of Generative AI tools</w:t>
+      </w:r>
+    </w:p>
+    <w:p>
+      <w:pPr>
+        <w:rPr>
+          <w:lang w:val="en-GB"/>
+        </w:rPr>
+      </w:pPr>
+    </w:p>
+    <w:p>
+      <w:pPr>
+        <w:rPr>
+          <w:lang w:val="en-GB"/>
+        </w:rPr>
+      </w:pPr>
+      <w:r>
+        <w:rPr>
+          <w:lang w:val="en-GB"/>
+        </w:rPr>
+        <w:t>Generative AI tools, including LLMs such as ChatGPT, Claude, Gemini, Copilot and similar systems, may be used in this course as learning and productivity tools.</w:t>
+      </w:r>
+    </w:p>
+    <w:p>
+      <w:pPr>
+        <w:rPr>
+          <w:lang w:val="en-GB"/>
+        </w:rPr>
+      </w:pPr>
+      <w:r>
+        <w:rPr>
+          <w:lang w:val="en-GB"/>
+        </w:rPr>
+        <w:t>Students may use them to clarify concepts, debug code, understand error messages, improve writing, generate small examples, or brainstorm project ideas. However, they must not be used to replace the student’s own understanding, reasoning, implementation, or analysis.</w:t>
+      </w:r>
+    </w:p>
+    <w:p>
+      <w:pPr>
+        <w:rPr>
+          <w:lang w:val="en-GB"/>
+        </w:rPr>
+      </w:pPr>
+      <w:r>
+        <w:rPr>
+          <w:lang w:val="en-GB"/>
+        </w:rPr>
+        <w:t>In particular:</w:t>
+      </w:r>
+    </w:p>
+    <w:p>
+      <w:pPr>
+        <w:rPr>
+          <w:lang w:val="en-GB"/>
+        </w:rPr>
+      </w:pPr>
+      <w:r>
+        <w:rPr>
+          <w:rFonts w:ascii="Segoe UI Symbol" w:hAnsi="Segoe UI Symbol" w:cs="Segoe UI Symbol"/>
+          <w:lang w:val="en-GB"/>
+        </w:rPr>
+        <w:t>✓</w:t>
+      </w:r>
+      <w:r>
+        <w:rPr>
+          <w:lang w:val="en-GB"/>
+        </w:rPr>
+        <w:t xml:space="preserve"> You may use Generative AI tools to support your learning.</w:t>
+      </w:r>
+    </w:p>
+    <w:p>
+      <w:pPr>
+        <w:rPr>
+          <w:lang w:val="en-GB"/>
+        </w:rPr>
+      </w:pPr>
+      <w:r>
+        <w:rPr>
+          <w:rFonts w:ascii="Segoe UI Symbol" w:hAnsi="Segoe UI Symbol" w:cs="Segoe UI Symbol"/>
+          <w:lang w:val="en-GB"/>
+        </w:rPr>
+        <w:t>✓</w:t>
+      </w:r>
+      <w:r>
+        <w:rPr>
+          <w:lang w:val="en-GB"/>
+        </w:rPr>
+        <w:t xml:space="preserve"> You may use them to improve the clarity or structure of your work.</w:t>
+      </w:r>
+    </w:p>
+    <w:p>
+      <w:pPr>
+        <w:rPr>
+          <w:lang w:val="en-GB"/>
+        </w:rPr>
+      </w:pPr>
+      <w:r>
+        <w:rPr>
+          <w:rFonts w:ascii="Segoe UI Symbol" w:hAnsi="Segoe UI Symbol" w:cs="Segoe UI Symbol"/>
+          <w:lang w:val="en-GB"/>
+        </w:rPr>
+        <w:t>✓</w:t>
+      </w:r>
+      <w:r>
+        <w:rPr>
+          <w:lang w:val="en-GB"/>
+        </w:rPr>
+        <w:t xml:space="preserve"> You may use them to help debug or better understand your code.</w:t>
+      </w:r>
+    </w:p>
+    <w:p>
+      <w:pPr>
+        <w:rPr>
+          <w:lang w:val="en-GB"/>
+        </w:rPr>
+      </w:pPr>
+      <w:r>
+        <w:rPr>
+          <w:rFonts w:ascii="Segoe UI Symbol" w:hAnsi="Segoe UI Symbol" w:cs="Segoe UI Symbol"/>
+          <w:lang w:val="en-GB"/>
+        </w:rPr>
+        <w:t>✗</w:t>
+      </w:r>
+      <w:r>
+        <w:rPr>
+          <w:lang w:val="en-GB"/>
+        </w:rPr>
+        <w:t xml:space="preserve"> You may not submit AI-generated answers, code, reports, or explanations that you do not understand.</w:t>
+      </w:r>
+    </w:p>
+    <w:p>
+      <w:pPr>
+        <w:rPr>
+          <w:lang w:val="en-GB"/>
+        </w:rPr>
+      </w:pPr>
+      <w:r>
+        <w:rPr>
+          <w:rFonts w:ascii="Segoe UI Symbol" w:hAnsi="Segoe UI Symbol" w:cs="Segoe UI Symbol"/>
+          <w:lang w:val="en-GB"/>
+        </w:rPr>
+        <w:t>✗</w:t>
+      </w:r>
+      <w:r>
+        <w:rPr>
+          <w:lang w:val="en-GB"/>
+        </w:rPr>
+        <w:t xml:space="preserve"> You may not use Generative AI tools during exams.</w:t>
+      </w:r>
+    </w:p>
+    <w:p>
+      <w:pPr>
+        <w:rPr>
+          <w:lang w:val="en-GB"/>
+        </w:rPr>
+      </w:pPr>
+      <w:r>
+        <w:rPr>
+          <w:rFonts w:ascii="Segoe UI Symbol" w:hAnsi="Segoe UI Symbol" w:cs="Segoe UI Symbol"/>
+          <w:lang w:val="en-GB"/>
+        </w:rPr>
+        <w:t>✗</w:t>
+      </w:r>
+      <w:r>
+        <w:rPr>
+          <w:lang w:val="en-GB"/>
+        </w:rPr>
+        <w:t xml:space="preserve"> You may not use AI tools to fabricate results, citations, experiments, or references.</w:t>
+      </w:r>
+    </w:p>
+    <w:p>
+      <w:pPr>
+        <w:rPr>
+          <w:lang w:val="en-GB"/>
+        </w:rPr>
+      </w:pPr>
+      <w:r>
+        <w:rPr>
+          <w:rFonts w:ascii="Segoe UI Symbol" w:hAnsi="Segoe UI Symbol" w:cs="Segoe UI Symbol"/>
+          <w:lang w:val="en-GB"/>
+        </w:rPr>
+        <w:t>✗</w:t>
+      </w:r>
+      <w:r>
+        <w:rPr>
+          <w:lang w:val="en-GB"/>
+        </w:rPr>
+        <w:t xml:space="preserve"> You may not use AI tools to disguise plagiarism or copy another student’s work.</w:t>
+      </w:r>
+    </w:p>
+    <w:p>
+      <w:pPr>
+        <w:rPr>
+          <w:lang w:val="en-GB"/>
+        </w:rPr>
+      </w:pPr>
+      <w:r>
+        <w:rPr>
+          <w:lang w:val="en-GB"/>
+        </w:rPr>
+        <w:t>Students remain fully responsible for everything they submit. You should be able to explain, justify, modify, and debug any submitted code, derivation, result, or written answer.</w:t>
+      </w:r>
+    </w:p>
+    <w:p>
+      <w:pPr>
+        <w:rPr>
+          <w:lang w:val="en-GB"/>
+        </w:rPr>
+      </w:pPr>
+      <w:r>
+        <w:rPr>
+          <w:lang w:val="en-GB"/>
+        </w:rPr>
+        <w:t>For homework and project submissions, students should briefly acknowledge meaningful use of Generative AI tools when applicable. For example:</w:t>
+      </w:r>
+      <w:r>
+        <w:rPr>
+          <w:lang w:val="en-GB"/>
+        </w:rPr>
+        <w:t xml:space="preserve"> </w:t>
+      </w:r>
+      <w:r>
+        <w:rPr>
+          <w:lang w:val="en-GB"/>
+        </w:rPr>
+        <w:t xml:space="preserve">“I used ChatGPT to help debug a </w:t>
+      </w:r>
+      <w:proofErr w:type="spellStart"/>
+      <w:r>
+        <w:rPr>
+          <w:lang w:val="en-GB"/>
+        </w:rPr>
+        <w:t>PyTorch</w:t>
+      </w:r>
+      <w:proofErr w:type="spellEnd"/>
+      <w:r>
+        <w:rPr>
+          <w:lang w:val="en-GB"/>
+        </w:rPr>
+        <w:t xml:space="preserve"> error. I reviewed, modified, and tested the final code myself.”</w:t>
+      </w:r>
+    </w:p>
+    <w:p>
+      <w:pPr>
+        <w:rPr>
+          <w:lang w:val="en-GB"/>
+        </w:rPr>
+      </w:pPr>
+      <w:r>
+        <w:rPr>
+          <w:lang w:val="en-GB"/>
+        </w:rPr>
+        <w:t>Misuse of Generative AI tools may be treated as an academic integrity issue. The goal is not to ban these tools, but to ensure that they are used responsibly, transparently, and in a way that supports genuine learning.</w:t>
+      </w:r>
+    </w:p>
     <w:sectPr>
-      <w:headerReference w:type="even" r:id="rId21"/>
-      <w:headerReference w:type="default" r:id="rId22"/>
-      <w:footerReference w:type="even" r:id="rId23"/>
-      <w:footerReference w:type="default" r:id="rId24"/>
-      <w:headerReference w:type="first" r:id="rId25"/>
-      <w:footerReference w:type="first" r:id="rId26"/>
+      <w:headerReference w:type="even" r:id="rId17"/>
+      <w:headerReference w:type="default" r:id="rId18"/>
+      <w:footerReference w:type="even" r:id="rId19"/>
+      <w:footerReference w:type="default" r:id="rId20"/>
+      <w:headerReference w:type="first" r:id="rId21"/>
+      <w:footerReference w:type="first" r:id="rId22"/>
       <w:pgSz w:w="11906" w:h="16838"/>
       <w:pgMar w:top="1440" w:right="1440" w:bottom="1440" w:left="1440" w:header="708" w:footer="708" w:gutter="0"/>
       <w:cols w:space="708"/>
@@ -6507,48 +7893,6 @@
     </w:sectPr>
   </w:body>
 </w:document>
-</file>
-
-<file path=word/comments.xml><?xml version="1.0" encoding="utf-8"?>
-<w:comments xmlns:wpc="http://schemas.microsoft.com/office/word/2010/wordprocessingCanvas" xmlns:cx="http://schemas.microsoft.com/office/drawing/2014/chartex" xmlns:cx1="http://schemas.microsoft.com/office/drawing/2015/9/8/chartex" xmlns:cx2="http://schemas.microsoft.com/office/drawing/2015/10/21/chartex" xmlns:cx3="http://schemas.microsoft.com/office/drawing/2016/5/9/chartex" xmlns:cx4="http://schemas.microsoft.com/office/drawing/2016/5/10/chartex" xmlns:cx5="http://schemas.microsoft.com/office/drawing/2016/5/11/chartex" xmlns:cx6="http://schemas.microsoft.com/office/drawing/2016/5/12/chartex" xmlns:cx7="http://schemas.microsoft.com/office/drawing/2016/5/13/chartex" xmlns:cx8="http://schemas.microsoft.com/office/drawing/2016/5/14/chartex" xmlns:mc="http://schemas.openxmlformats.org/markup-compatibility/2006" xmlns:aink="http://schemas.microsoft.com/office/drawing/2016/ink" xmlns:am3d="http://schemas.microsoft.com/office/drawing/2017/model3d" xmlns:o="urn:schemas-microsoft-com:office:office" xmlns:oel="http://schemas.microsoft.com/office/2019/extlst" xmlns:r="http://schemas.openxmlformats.org/officeDocument/2006/relationships" xmlns:m="http://schemas.openxmlformats.org/officeDocument/2006/math" xmlns:v="urn:schemas-microsoft-com:vml" xmlns:wp14="http://schemas.microsoft.com/office/word/2010/wordprocessingDrawing" xmlns:wp="http://schemas.openxmlformats.org/drawingml/2006/wordprocessingDrawing" xmlns:w10="urn:schemas-microsoft-com:office:word" xmlns:w="http://schemas.openxmlformats.org/wordprocessingml/2006/main" xmlns:w14="http://schemas.microsoft.com/office/word/2010/wordml" xmlns:w15="http://schemas.microsoft.com/office/word/2012/wordml" xmlns:w16cex="http://schemas.microsoft.com/office/word/2018/wordml/cex" xmlns:w16cid="http://schemas.microsoft.com/office/word/2016/wordml/cid" xmlns:w16="http://schemas.microsoft.com/office/word/2018/wordml" xmlns:w16du="http://schemas.microsoft.com/office/word/2023/wordml/word16du" xmlns:w16sdtdh="http://schemas.microsoft.com/office/word/2020/wordml/sdtdatahash" xmlns:w16sdtfl="http://schemas.microsoft.com/office/word/2024/wordml/sdtformatlock" xmlns:w16se="http://schemas.microsoft.com/office/word/2015/wordml/symex" xmlns:wpg="http://schemas.microsoft.com/office/word/2010/wordprocessingGroup" xmlns:wpi="http://schemas.microsoft.com/office/word/2010/wordprocessingInk" xmlns:wne="http://schemas.microsoft.com/office/word/2006/wordml" xmlns:wps="http://schemas.microsoft.com/office/word/2010/wordprocessingShape" mc:Ignorable="w14 w15 w16se w16cid w16 w16cex w16sdtdh w16sdtfl w16du wp14">
-  <w:comment w:id="0" w:author="Matthieu De Mari" w:date="2025-10-31T13:12:00Z" w:initials="MD">
-    <w:p>
-      <w:pPr>
-        <w:pStyle w:val="CommentText"/>
-      </w:pPr>
-      <w:r>
-        <w:rPr>
-          <w:rStyle w:val="CommentReference"/>
-        </w:rPr>
-        <w:annotationRef/>
-      </w:r>
-      <w:r>
-        <w:rPr>
-          <w:lang w:val="fr-FR"/>
-        </w:rPr>
-        <w:t>TBC</w:t>
-      </w:r>
-    </w:p>
-  </w:comment>
-</w:comments>
-</file>
-
-<file path=word/commentsExtended.xml><?xml version="1.0" encoding="utf-8"?>
-<w15:commentsEx xmlns:wpc="http://schemas.microsoft.com/office/word/2010/wordprocessingCanvas" xmlns:cx="http://schemas.microsoft.com/office/drawing/2014/chartex" xmlns:cx1="http://schemas.microsoft.com/office/drawing/2015/9/8/chartex" xmlns:cx2="http://schemas.microsoft.com/office/drawing/2015/10/21/chartex" xmlns:cx3="http://schemas.microsoft.com/office/drawing/2016/5/9/chartex" xmlns:cx4="http://schemas.microsoft.com/office/drawing/2016/5/10/chartex" xmlns:cx5="http://schemas.microsoft.com/office/drawing/2016/5/11/chartex" xmlns:cx6="http://schemas.microsoft.com/office/drawing/2016/5/12/chartex" xmlns:cx7="http://schemas.microsoft.com/office/drawing/2016/5/13/chartex" xmlns:cx8="http://schemas.microsoft.com/office/drawing/2016/5/14/chartex" xmlns:mc="http://schemas.openxmlformats.org/markup-compatibility/2006" xmlns:aink="http://schemas.microsoft.com/office/drawing/2016/ink" xmlns:am3d="http://schemas.microsoft.com/office/drawing/2017/model3d" xmlns:o="urn:schemas-microsoft-com:office:office" xmlns:oel="http://schemas.microsoft.com/office/2019/extlst" xmlns:r="http://schemas.openxmlformats.org/officeDocument/2006/relationships" xmlns:m="http://schemas.openxmlformats.org/officeDocument/2006/math" xmlns:v="urn:schemas-microsoft-com:vml" xmlns:wp14="http://schemas.microsoft.com/office/word/2010/wordprocessingDrawing" xmlns:wp="http://schemas.openxmlformats.org/drawingml/2006/wordprocessingDrawing" xmlns:w10="urn:schemas-microsoft-com:office:word" xmlns:w="http://schemas.openxmlformats.org/wordprocessingml/2006/main" xmlns:w14="http://schemas.microsoft.com/office/word/2010/wordml" xmlns:w15="http://schemas.microsoft.com/office/word/2012/wordml" xmlns:w16cex="http://schemas.microsoft.com/office/word/2018/wordml/cex" xmlns:w16cid="http://schemas.microsoft.com/office/word/2016/wordml/cid" xmlns:w16="http://schemas.microsoft.com/office/word/2018/wordml" xmlns:w16du="http://schemas.microsoft.com/office/word/2023/wordml/word16du" xmlns:w16sdtdh="http://schemas.microsoft.com/office/word/2020/wordml/sdtdatahash" xmlns:w16sdtfl="http://schemas.microsoft.com/office/word/2024/wordml/sdtformatlock" xmlns:w16se="http://schemas.microsoft.com/office/word/2015/wordml/symex" xmlns:wpg="http://schemas.microsoft.com/office/word/2010/wordprocessingGroup" xmlns:wpi="http://schemas.microsoft.com/office/word/2010/wordprocessingInk" xmlns:wne="http://schemas.microsoft.com/office/word/2006/wordml" xmlns:wps="http://schemas.microsoft.com/office/word/2010/wordprocessingShape" mc:Ignorable="w14 w15 w16se w16cid w16 w16cex w16sdtdh w16sdtfl w16du wp14">
-  <w15:commentEx w15:paraId="527F0DC8" w15:done="0"/>
-</w15:commentsEx>
-</file>
-
-<file path=word/commentsExtensible.xml><?xml version="1.0" encoding="utf-8"?>
-<w16cex:commentsExtensible xmlns:wpc="http://schemas.microsoft.com/office/word/2010/wordprocessingCanvas" xmlns:cx="http://schemas.microsoft.com/office/drawing/2014/chartex" xmlns:cx1="http://schemas.microsoft.com/office/drawing/2015/9/8/chartex" xmlns:cx2="http://schemas.microsoft.com/office/drawing/2015/10/21/chartex" xmlns:cx3="http://schemas.microsoft.com/office/drawing/2016/5/9/chartex" xmlns:cx4="http://schemas.microsoft.com/office/drawing/2016/5/10/chartex" xmlns:cx5="http://schemas.microsoft.com/office/drawing/2016/5/11/chartex" xmlns:cx6="http://schemas.microsoft.com/office/drawing/2016/5/12/chartex" xmlns:cx7="http://schemas.microsoft.com/office/drawing/2016/5/13/chartex" xmlns:cx8="http://schemas.microsoft.com/office/drawing/2016/5/14/chartex" xmlns:cr="http://schemas.microsoft.com/office/comments/2020/reactions" xmlns:mc="http://schemas.openxmlformats.org/markup-compatibility/2006" xmlns:aink="http://schemas.microsoft.com/office/drawing/2016/ink" xmlns:am3d="http://schemas.microsoft.com/office/drawing/2017/model3d" xmlns:o="urn:schemas-microsoft-com:office:office" xmlns:oel="http://schemas.microsoft.com/office/2019/extlst" xmlns:r="http://schemas.openxmlformats.org/officeDocument/2006/relationships" xmlns:m="http://schemas.openxmlformats.org/officeDocument/2006/math" xmlns:v="urn:schemas-microsoft-com:vml" xmlns:wp14="http://schemas.microsoft.com/office/word/2010/wordprocessingDrawing" xmlns:wp="http://schemas.openxmlformats.org/drawingml/2006/wordprocessingDrawing" xmlns:w10="urn:schemas-microsoft-com:office:word" xmlns:w="http://schemas.openxmlformats.org/wordprocessingml/2006/main" xmlns:w14="http://schemas.microsoft.com/office/word/2010/wordml" xmlns:w15="http://schemas.microsoft.com/office/word/2012/wordml" xmlns:w16cex="http://schemas.microsoft.com/office/word/2018/wordml/cex" xmlns:w16cid="http://schemas.microsoft.com/office/word/2016/wordml/cid" xmlns:w16="http://schemas.microsoft.com/office/word/2018/wordml" xmlns:w16du="http://schemas.microsoft.com/office/word/2023/wordml/word16du" xmlns:w16sdtdh="http://schemas.microsoft.com/office/word/2020/wordml/sdtdatahash" xmlns:w16sdtfl="http://schemas.microsoft.com/office/word/2024/wordml/sdtformatlock" xmlns:w16se="http://schemas.microsoft.com/office/word/2015/wordml/symex" xmlns:wpg="http://schemas.microsoft.com/office/word/2010/wordprocessingGroup" xmlns:wpi="http://schemas.microsoft.com/office/word/2010/wordprocessingInk" xmlns:wne="http://schemas.microsoft.com/office/word/2006/wordml" xmlns:wps="http://schemas.microsoft.com/office/word/2010/wordprocessingShape" mc:Ignorable="w14 w15 w16se w16cid w16 w16cex w16sdtdh w16sdtfl cr w16du wp14">
-  <w16cex:commentExtensible w16cex:durableId="343A38BD" w16cex:dateUtc="2025-10-31T05:12:00Z"/>
-</w16cex:commentsExtensible>
-</file>
-
-<file path=word/commentsIds.xml><?xml version="1.0" encoding="utf-8"?>
-<w16cid:commentsIds xmlns:wpc="http://schemas.microsoft.com/office/word/2010/wordprocessingCanvas" xmlns:cx="http://schemas.microsoft.com/office/drawing/2014/chartex" xmlns:cx1="http://schemas.microsoft.com/office/drawing/2015/9/8/chartex" xmlns:cx2="http://schemas.microsoft.com/office/drawing/2015/10/21/chartex" xmlns:cx3="http://schemas.microsoft.com/office/drawing/2016/5/9/chartex" xmlns:cx4="http://schemas.microsoft.com/office/drawing/2016/5/10/chartex" xmlns:cx5="http://schemas.microsoft.com/office/drawing/2016/5/11/chartex" xmlns:cx6="http://schemas.microsoft.com/office/drawing/2016/5/12/chartex" xmlns:cx7="http://schemas.microsoft.com/office/drawing/2016/5/13/chartex" xmlns:cx8="http://schemas.microsoft.com/office/drawing/2016/5/14/chartex" xmlns:mc="http://schemas.openxmlformats.org/markup-compatibility/2006" xmlns:aink="http://schemas.microsoft.com/office/drawing/2016/ink" xmlns:am3d="http://schemas.microsoft.com/office/drawing/2017/model3d" xmlns:o="urn:schemas-microsoft-com:office:office" xmlns:oel="http://schemas.microsoft.com/office/2019/extlst" xmlns:r="http://schemas.openxmlformats.org/officeDocument/2006/relationships" xmlns:m="http://schemas.openxmlformats.org/officeDocument/2006/math" xmlns:v="urn:schemas-microsoft-com:vml" xmlns:wp14="http://schemas.microsoft.com/office/word/2010/wordprocessingDrawing" xmlns:wp="http://schemas.openxmlformats.org/drawingml/2006/wordprocessingDrawing" xmlns:w10="urn:schemas-microsoft-com:office:word" xmlns:w="http://schemas.openxmlformats.org/wordprocessingml/2006/main" xmlns:w14="http://schemas.microsoft.com/office/word/2010/wordml" xmlns:w15="http://schemas.microsoft.com/office/word/2012/wordml" xmlns:w16cex="http://schemas.microsoft.com/office/word/2018/wordml/cex" xmlns:w16cid="http://schemas.microsoft.com/office/word/2016/wordml/cid" xmlns:w16="http://schemas.microsoft.com/office/word/2018/wordml" xmlns:w16du="http://schemas.microsoft.com/office/word/2023/wordml/word16du" xmlns:w16sdtdh="http://schemas.microsoft.com/office/word/2020/wordml/sdtdatahash" xmlns:w16sdtfl="http://schemas.microsoft.com/office/word/2024/wordml/sdtformatlock" xmlns:w16se="http://schemas.microsoft.com/office/word/2015/wordml/symex" xmlns:wpg="http://schemas.microsoft.com/office/word/2010/wordprocessingGroup" xmlns:wpi="http://schemas.microsoft.com/office/word/2010/wordprocessingInk" xmlns:wne="http://schemas.microsoft.com/office/word/2006/wordml" xmlns:wps="http://schemas.microsoft.com/office/word/2010/wordprocessingShape" mc:Ignorable="w14 w15 w16se w16cid w16 w16cex w16sdtdh w16sdtfl w16du wp14">
-  <w16cid:commentId w16cid:paraId="527F0DC8" w16cid:durableId="343A38BD"/>
-</w16cid:commentsIds>
 </file>
 
 <file path=word/endnotes.xml><?xml version="1.0" encoding="utf-8"?>
@@ -9701,14 +11045,6 @@
     <w:abstractNumId w:val="18"/>
   </w:num>
 </w:numbering>
-</file>
-
-<file path=word/people.xml><?xml version="1.0" encoding="utf-8"?>
-<w15:people xmlns:wpc="http://schemas.microsoft.com/office/word/2010/wordprocessingCanvas" xmlns:cx="http://schemas.microsoft.com/office/drawing/2014/chartex" xmlns:cx1="http://schemas.microsoft.com/office/drawing/2015/9/8/chartex" xmlns:cx2="http://schemas.microsoft.com/office/drawing/2015/10/21/chartex" xmlns:cx3="http://schemas.microsoft.com/office/drawing/2016/5/9/chartex" xmlns:cx4="http://schemas.microsoft.com/office/drawing/2016/5/10/chartex" xmlns:cx5="http://schemas.microsoft.com/office/drawing/2016/5/11/chartex" xmlns:cx6="http://schemas.microsoft.com/office/drawing/2016/5/12/chartex" xmlns:cx7="http://schemas.microsoft.com/office/drawing/2016/5/13/chartex" xmlns:cx8="http://schemas.microsoft.com/office/drawing/2016/5/14/chartex" xmlns:mc="http://schemas.openxmlformats.org/markup-compatibility/2006" xmlns:aink="http://schemas.microsoft.com/office/drawing/2016/ink" xmlns:am3d="http://schemas.microsoft.com/office/drawing/2017/model3d" xmlns:o="urn:schemas-microsoft-com:office:office" xmlns:oel="http://schemas.microsoft.com/office/2019/extlst" xmlns:r="http://schemas.openxmlformats.org/officeDocument/2006/relationships" xmlns:m="http://schemas.openxmlformats.org/officeDocument/2006/math" xmlns:v="urn:schemas-microsoft-com:vml" xmlns:wp14="http://schemas.microsoft.com/office/word/2010/wordprocessingDrawing" xmlns:wp="http://schemas.openxmlformats.org/drawingml/2006/wordprocessingDrawing" xmlns:w10="urn:schemas-microsoft-com:office:word" xmlns:w="http://schemas.openxmlformats.org/wordprocessingml/2006/main" xmlns:w14="http://schemas.microsoft.com/office/word/2010/wordml" xmlns:w15="http://schemas.microsoft.com/office/word/2012/wordml" xmlns:w16cex="http://schemas.microsoft.com/office/word/2018/wordml/cex" xmlns:w16cid="http://schemas.microsoft.com/office/word/2016/wordml/cid" xmlns:w16="http://schemas.microsoft.com/office/word/2018/wordml" xmlns:w16du="http://schemas.microsoft.com/office/word/2023/wordml/word16du" xmlns:w16sdtdh="http://schemas.microsoft.com/office/word/2020/wordml/sdtdatahash" xmlns:w16sdtfl="http://schemas.microsoft.com/office/word/2024/wordml/sdtformatlock" xmlns:w16se="http://schemas.microsoft.com/office/word/2015/wordml/symex" xmlns:wpg="http://schemas.microsoft.com/office/word/2010/wordprocessingGroup" xmlns:wpi="http://schemas.microsoft.com/office/word/2010/wordprocessingInk" xmlns:wne="http://schemas.microsoft.com/office/word/2006/wordml" xmlns:wps="http://schemas.microsoft.com/office/word/2010/wordprocessingShape" mc:Ignorable="w14 w15 w16se w16cid w16 w16cex w16sdtdh w16sdtfl w16du wp14">
-  <w15:person w15:author="Matthieu De Mari">
-    <w15:presenceInfo w15:providerId="AD" w15:userId="S::matthieu_demari@sutd.edu.sg::dfb708c9-d8dc-439f-9a3b-c772bf4a311c"/>
-  </w15:person>
-</w15:people>
 </file>
 
 <file path=word/styles.xml><?xml version="1.0" encoding="utf-8"?>

</xml_diff>